<commit_message>
Glossaries v1.1: remove embedded bill citations, move process terms to shared companion, fit 2 Word pages
Co-authored-by: CaptainWrechols <CaptainWrechols@users.noreply.github.com>
</commit_message>
<xml_diff>
--- a/briefs/nevada/cost-of-living/citizen-v3/glossary.docx
+++ b/briefs/nevada/cost-of-living/citizen-v3/glossary.docx
@@ -54,377 +54,7 @@
           <w:color w:val="444444"/>
           <w:sz w:val="20"/>
         </w:rPr>
-        <w:t>Plain-language definitions for the terms, ideas, and acronyms used in "The Rising Cost of Living in Nevada: Health Care" (citizen brief v3.0).</w:t>
-      </w:r>
-    </w:p>
-    <w:p>
-      <w:pPr>
-        <w:widowControl/>
-        <w:spacing w:before="100" w:after="40" w:lineRule="auto" w:line="254"/>
-      </w:pPr>
-      <w:r>
-        <w:rPr>
-          <w:rFonts w:ascii="Arial" w:hAnsi="Arial" w:cs="Arial" w:eastAsia="Arial"/>
-          <w:b/>
-          <w:color w:val="C0392B"/>
-          <w:sz w:val="25"/>
-          <w:spacing w:val="20"/>
-        </w:rPr>
-        <w:t>HOW NEVADA LAWMAKING WORKS</w:t>
-      </w:r>
-    </w:p>
-    <w:p>
-      <w:pPr>
-        <w:widowControl/>
-        <w:spacing w:before="0" w:after="40" w:lineRule="auto" w:line="247"/>
-      </w:pPr>
-      <w:r>
-        <w:rPr>
-          <w:rFonts w:ascii="Arial" w:hAnsi="Arial" w:cs="Arial" w:eastAsia="Arial"/>
-          <w:b w:val="0"/>
-          <w:i/>
-          <w:color w:val="666666"/>
-          <w:sz w:val="20"/>
-        </w:rPr>
-        <w:t>Process terms that appear throughout the brief.</w:t>
-      </w:r>
-    </w:p>
-    <w:p>
-      <w:pPr>
-        <w:keepLines/>
-        <w:widowControl/>
-        <w:spacing w:before="0" w:after="56" w:lineRule="auto" w:line="247"/>
-        <w:jc w:val="both"/>
-      </w:pPr>
-      <w:r>
-        <w:rPr>
-          <w:rFonts w:ascii="Arial" w:hAnsi="Arial" w:cs="Arial" w:eastAsia="Arial"/>
-          <w:b/>
-          <w:color w:val="1A2D4F"/>
-          <w:sz w:val="20"/>
-        </w:rPr>
-        <w:t>Session / special session.</w:t>
-      </w:r>
-      <w:r>
-        <w:rPr>
-          <w:rFonts w:ascii="Arial" w:hAnsi="Arial" w:cs="Arial" w:eastAsia="Arial"/>
-          <w:b w:val="0"/>
-          <w:color w:val="444444"/>
-          <w:sz w:val="20"/>
-        </w:rPr>
-        <w:t xml:space="preserve"> The Nevada Legislature meets in a regular session of 120 days in odd-numbered years — 2019, 2021, 2023, and 2025 in this record. A bill that has not finished every step when the session ends is dead and must start over in a future session. A special session is a short extra meeting called for specific topics, like the November 2025 session that enacted the provider-shortage grant program.</w:t>
-      </w:r>
-    </w:p>
-    <w:p>
-      <w:pPr>
-        <w:keepLines/>
-        <w:widowControl/>
-        <w:spacing w:before="0" w:after="56" w:lineRule="auto" w:line="247"/>
-        <w:jc w:val="both"/>
-      </w:pPr>
-      <w:r>
-        <w:rPr>
-          <w:rFonts w:ascii="Arial" w:hAnsi="Arial" w:cs="Arial" w:eastAsia="Arial"/>
-          <w:b/>
-          <w:color w:val="1A2D4F"/>
-          <w:sz w:val="20"/>
-        </w:rPr>
-        <w:t>Chambers.</w:t>
-      </w:r>
-      <w:r>
-        <w:rPr>
-          <w:rFonts w:ascii="Arial" w:hAnsi="Arial" w:cs="Arial" w:eastAsia="Arial"/>
-          <w:b w:val="0"/>
-          <w:color w:val="444444"/>
-          <w:sz w:val="20"/>
-        </w:rPr>
-        <w:t xml:space="preserve"> The Legislature's two houses: the Assembly (42 members) and the Senate (21 members). A bill must pass both chambers to reach the governor.</w:t>
-      </w:r>
-    </w:p>
-    <w:p>
-      <w:pPr>
-        <w:keepLines/>
-        <w:widowControl/>
-        <w:spacing w:before="0" w:after="56" w:lineRule="auto" w:line="247"/>
-        <w:jc w:val="both"/>
-      </w:pPr>
-      <w:r>
-        <w:rPr>
-          <w:rFonts w:ascii="Arial" w:hAnsi="Arial" w:cs="Arial" w:eastAsia="Arial"/>
-          <w:b/>
-          <w:color w:val="1A2D4F"/>
-          <w:sz w:val="20"/>
-        </w:rPr>
-        <w:t>Vote pairs such as "18–2 and 42–0."</w:t>
-      </w:r>
-      <w:r>
-        <w:rPr>
-          <w:rFonts w:ascii="Arial" w:hAnsi="Arial" w:cs="Arial" w:eastAsia="Arial"/>
-          <w:b w:val="0"/>
-          <w:color w:val="444444"/>
-          <w:sz w:val="20"/>
-        </w:rPr>
-        <w:t xml:space="preserve"> The brief lists floor votes as yes–no tallies, one per chamber. 42–0 is a unanimous Assembly vote; 21–0 is a unanimous Senate vote.</w:t>
-      </w:r>
-    </w:p>
-    <w:p>
-      <w:pPr>
-        <w:keepLines/>
-        <w:widowControl/>
-        <w:spacing w:before="0" w:after="56" w:lineRule="auto" w:line="247"/>
-        <w:jc w:val="both"/>
-      </w:pPr>
-      <w:r>
-        <w:rPr>
-          <w:rFonts w:ascii="Arial" w:hAnsi="Arial" w:cs="Arial" w:eastAsia="Arial"/>
-          <w:b/>
-          <w:color w:val="1A2D4F"/>
-          <w:sz w:val="20"/>
-        </w:rPr>
-        <w:t>Committee / first committee.</w:t>
-      </w:r>
-      <w:r>
-        <w:rPr>
-          <w:rFonts w:ascii="Arial" w:hAnsi="Arial" w:cs="Arial" w:eastAsia="Arial"/>
-          <w:b w:val="0"/>
-          <w:color w:val="444444"/>
-          <w:sz w:val="20"/>
-        </w:rPr>
-        <w:t xml:space="preserve"> A small panel of lawmakers that studies a bill and votes on whether to send it onward. Every bill starts in a committee, and most bills that fail die there — in their "first committee" — without the full chamber ever voting.</w:t>
-      </w:r>
-    </w:p>
-    <w:p>
-      <w:pPr>
-        <w:keepLines/>
-        <w:widowControl/>
-        <w:spacing w:before="0" w:after="56" w:lineRule="auto" w:line="247"/>
-        <w:jc w:val="both"/>
-      </w:pPr>
-      <w:r>
-        <w:rPr>
-          <w:rFonts w:ascii="Arial" w:hAnsi="Arial" w:cs="Arial" w:eastAsia="Arial"/>
-          <w:b/>
-          <w:color w:val="1A2D4F"/>
-          <w:sz w:val="20"/>
-        </w:rPr>
-        <w:t>Floor vote.</w:t>
-      </w:r>
-      <w:r>
-        <w:rPr>
-          <w:rFonts w:ascii="Arial" w:hAnsi="Arial" w:cs="Arial" w:eastAsia="Arial"/>
-          <w:b w:val="0"/>
-          <w:color w:val="444444"/>
-          <w:sz w:val="20"/>
-        </w:rPr>
-        <w:t xml:space="preserve"> A vote of the full chamber. "Never lost a floor vote" means every defeat happened somewhere other than a chamber-wide vote.</w:t>
-      </w:r>
-    </w:p>
-    <w:p>
-      <w:pPr>
-        <w:keepLines/>
-        <w:widowControl/>
-        <w:spacing w:before="0" w:after="56" w:lineRule="auto" w:line="247"/>
-        <w:jc w:val="both"/>
-      </w:pPr>
-      <w:r>
-        <w:rPr>
-          <w:rFonts w:ascii="Arial" w:hAnsi="Arial" w:cs="Arial" w:eastAsia="Arial"/>
-          <w:b/>
-          <w:color w:val="1A2D4F"/>
-          <w:sz w:val="20"/>
-        </w:rPr>
-        <w:t>Second house.</w:t>
-      </w:r>
-      <w:r>
-        <w:rPr>
-          <w:rFonts w:ascii="Arial" w:hAnsi="Arial" w:cs="Arial" w:eastAsia="Arial"/>
-          <w:b w:val="0"/>
-          <w:color w:val="444444"/>
-          <w:sz w:val="20"/>
-        </w:rPr>
-        <w:t xml:space="preserve"> After passing the chamber where it started, a bill repeats the whole process — committee, then floor — in the other chamber.</w:t>
-      </w:r>
-    </w:p>
-    <w:p>
-      <w:pPr>
-        <w:keepLines/>
-        <w:widowControl/>
-        <w:spacing w:before="0" w:after="56" w:lineRule="auto" w:line="247"/>
-        <w:jc w:val="both"/>
-      </w:pPr>
-      <w:r>
-        <w:rPr>
-          <w:rFonts w:ascii="Arial" w:hAnsi="Arial" w:cs="Arial" w:eastAsia="Arial"/>
-          <w:b/>
-          <w:color w:val="1A2D4F"/>
-          <w:sz w:val="20"/>
-        </w:rPr>
-        <w:t>Amendment / concurrence.</w:t>
-      </w:r>
-      <w:r>
-        <w:rPr>
-          <w:rFonts w:ascii="Arial" w:hAnsi="Arial" w:cs="Arial" w:eastAsia="Arial"/>
-          <w:b w:val="0"/>
-          <w:color w:val="444444"/>
-          <w:sz w:val="20"/>
-        </w:rPr>
-        <w:t xml:space="preserve"> A change made to a bill along the way. When one chamber amends a bill, the other must vote to accept — "concur in" — the change before the bill can go to the governor. SB316 (2025) died awaiting exactly that final concurrence vote.</w:t>
-      </w:r>
-    </w:p>
-    <w:p>
-      <w:pPr>
-        <w:keepLines/>
-        <w:widowControl/>
-        <w:spacing w:before="0" w:after="56" w:lineRule="auto" w:line="247"/>
-        <w:jc w:val="both"/>
-      </w:pPr>
-      <w:r>
-        <w:rPr>
-          <w:rFonts w:ascii="Arial" w:hAnsi="Arial" w:cs="Arial" w:eastAsia="Arial"/>
-          <w:b/>
-          <w:color w:val="1A2D4F"/>
-          <w:sz w:val="20"/>
-        </w:rPr>
-        <w:t>Veto.</w:t>
-      </w:r>
-      <w:r>
-        <w:rPr>
-          <w:rFonts w:ascii="Arial" w:hAnsi="Arial" w:cs="Arial" w:eastAsia="Arial"/>
-          <w:b w:val="0"/>
-          <w:color w:val="444444"/>
-          <w:sz w:val="20"/>
-        </w:rPr>
-        <w:t xml:space="preserve"> The governor's rejection of a bill that passed both chambers. A vetoed bill does not become law unless two-thirds of each chamber votes to override.</w:t>
-      </w:r>
-    </w:p>
-    <w:p>
-      <w:pPr>
-        <w:keepLines/>
-        <w:widowControl/>
-        <w:spacing w:before="0" w:after="56" w:lineRule="auto" w:line="247"/>
-        <w:jc w:val="both"/>
-      </w:pPr>
-      <w:r>
-        <w:rPr>
-          <w:rFonts w:ascii="Arial" w:hAnsi="Arial" w:cs="Arial" w:eastAsia="Arial"/>
-          <w:b/>
-          <w:color w:val="1A2D4F"/>
-          <w:sz w:val="20"/>
-        </w:rPr>
-        <w:t>Died at session's end / clock death.</w:t>
-      </w:r>
-      <w:r>
-        <w:rPr>
-          <w:rFonts w:ascii="Arial" w:hAnsi="Arial" w:cs="Arial" w:eastAsia="Arial"/>
-          <w:b w:val="0"/>
-          <w:color w:val="444444"/>
-          <w:sz w:val="20"/>
-        </w:rPr>
-        <w:t xml:space="preserve"> The fate of a bill that cleared every vote taken but ran out of calendar before the final procedural step.</w:t>
-      </w:r>
-    </w:p>
-    <w:p>
-      <w:pPr>
-        <w:keepLines/>
-        <w:widowControl/>
-        <w:spacing w:before="0" w:after="56" w:lineRule="auto" w:line="247"/>
-        <w:jc w:val="both"/>
-      </w:pPr>
-      <w:r>
-        <w:rPr>
-          <w:rFonts w:ascii="Arial" w:hAnsi="Arial" w:cs="Arial" w:eastAsia="Arial"/>
-          <w:b/>
-          <w:color w:val="1A2D4F"/>
-          <w:sz w:val="20"/>
-        </w:rPr>
-        <w:t>The money stage.</w:t>
-      </w:r>
-      <w:r>
-        <w:rPr>
-          <w:rFonts w:ascii="Arial" w:hAnsi="Arial" w:cs="Arial" w:eastAsia="Arial"/>
-          <w:b w:val="0"/>
-          <w:color w:val="444444"/>
-          <w:sz w:val="20"/>
-        </w:rPr>
-        <w:t xml:space="preserve"> The budget review where bills that cost money must be funded. "Died at the money stage" means a bill stopped over its price tag, without a vote against the policy itself.</w:t>
-      </w:r>
-    </w:p>
-    <w:p>
-      <w:pPr>
-        <w:keepLines/>
-        <w:widowControl/>
-        <w:spacing w:before="0" w:after="56" w:lineRule="auto" w:line="247"/>
-        <w:jc w:val="both"/>
-      </w:pPr>
-      <w:r>
-        <w:rPr>
-          <w:rFonts w:ascii="Arial" w:hAnsi="Arial" w:cs="Arial" w:eastAsia="Arial"/>
-          <w:b/>
-          <w:color w:val="1A2D4F"/>
-          <w:sz w:val="20"/>
-        </w:rPr>
-        <w:t>Sponsor.</w:t>
-      </w:r>
-      <w:r>
-        <w:rPr>
-          <w:rFonts w:ascii="Arial" w:hAnsi="Arial" w:cs="Arial" w:eastAsia="Arial"/>
-          <w:b w:val="0"/>
-          <w:color w:val="444444"/>
-          <w:sz w:val="20"/>
-        </w:rPr>
-        <w:t xml:space="preserve"> The lawmaker or committee that formally introduces a bill. Cross-party sponsorship means named sponsors from both parties.</w:t>
-      </w:r>
-    </w:p>
-    <w:p>
-      <w:pPr>
-        <w:keepLines/>
-        <w:widowControl/>
-        <w:spacing w:before="0" w:after="56" w:lineRule="auto" w:line="247"/>
-        <w:jc w:val="both"/>
-      </w:pPr>
-      <w:r>
-        <w:rPr>
-          <w:rFonts w:ascii="Arial" w:hAnsi="Arial" w:cs="Arial" w:eastAsia="Arial"/>
-          <w:b/>
-          <w:color w:val="1A2D4F"/>
-          <w:sz w:val="20"/>
-        </w:rPr>
-        <w:t>Statute.</w:t>
-      </w:r>
-      <w:r>
-        <w:rPr>
-          <w:rFonts w:ascii="Arial" w:hAnsi="Arial" w:cs="Arial" w:eastAsia="Arial"/>
-          <w:b w:val="0"/>
-          <w:color w:val="444444"/>
-          <w:sz w:val="20"/>
-        </w:rPr>
-        <w:t xml:space="preserve"> A law on the books. "In statute" means an idea is already law.</w:t>
-      </w:r>
-    </w:p>
-    <w:p>
-      <w:pPr>
-        <w:keepLines/>
-        <w:widowControl/>
-        <w:spacing w:before="0" w:after="56" w:lineRule="auto" w:line="247"/>
-        <w:jc w:val="both"/>
-      </w:pPr>
-      <w:r>
-        <w:rPr>
-          <w:rFonts w:ascii="Arial" w:hAnsi="Arial" w:cs="Arial" w:eastAsia="Arial"/>
-          <w:b/>
-          <w:color w:val="1A2D4F"/>
-          <w:sz w:val="20"/>
-        </w:rPr>
-        <w:t>Appropriation.</w:t>
-      </w:r>
-      <w:r>
-        <w:rPr>
-          <w:rFonts w:ascii="Arial" w:hAnsi="Arial" w:cs="Arial" w:eastAsia="Arial"/>
-          <w:b w:val="0"/>
-          <w:color w:val="444444"/>
-          <w:sz w:val="20"/>
-        </w:rPr>
-        <w:t xml:space="preserve"> A bill or provision that sets aside state money for a purpose.</w:t>
+        <w:t>Plain-language definitions for the terms and acronyms in "The Rising Cost of Living in Nevada: Health Care" (citizen brief v3.0). Lawmaking-process terms are in the shared companion, "How Nevada Lawmaking Works."</w:t>
       </w:r>
     </w:p>
     <w:p>
@@ -482,7 +112,7 @@
           <w:color w:val="444444"/>
           <w:sz w:val="20"/>
         </w:rPr>
-        <w:t xml:space="preserve"> A middleman company hired by insurers to run prescription-drug benefits — deciding which drugs are covered, negotiating rebates from drugmakers, and setting what pharmacies get paid. PBM practices are a major driver of what patients pay at the counter.</w:t>
+        <w:t xml:space="preserve"> A middleman hired by insurers to run drug benefits — deciding which drugs are covered, negotiating rebates from drugmakers, and setting what pharmacies get paid. A major driver of what patients pay at the counter.</w:t>
       </w:r>
     </w:p>
     <w:p>
@@ -508,7 +138,7 @@
           <w:color w:val="444444"/>
           <w:sz w:val="20"/>
         </w:rPr>
-        <w:t xml:space="preserve"> A contract term that barred pharmacists from volunteering that paying cash would be cheaper than using insurance; banned by AB141 (2019).</w:t>
+        <w:t xml:space="preserve"> A contract term that barred pharmacists from volunteering that paying cash would be cheaper than using insurance; now banned in Nevada.</w:t>
       </w:r>
     </w:p>
     <w:p>
@@ -534,7 +164,7 @@
           <w:color w:val="444444"/>
           <w:sz w:val="20"/>
         </w:rPr>
-        <w:t xml:space="preserve"> Requiring the discounts drugmakers pay to PBMs to be passed along to the payer — Nevada requires this for Medicaid (SB378, 2019).</w:t>
+        <w:t xml:space="preserve"> Requiring the discounts drugmakers pay to PBMs to be passed along to the payer, as Nevada requires for Medicaid.</w:t>
       </w:r>
     </w:p>
     <w:p>
@@ -560,7 +190,7 @@
           <w:color w:val="444444"/>
           <w:sz w:val="20"/>
         </w:rPr>
-        <w:t xml:space="preserve"> A federal program letting hospitals and clinics that serve low-income patients buy drugs at deep discounts; AB434 (2023) protects those providers.</w:t>
+        <w:t xml:space="preserve"> A federal program letting hospitals and clinics that serve low-income patients buy drugs at deep discounts.</w:t>
       </w:r>
     </w:p>
     <w:p>
@@ -586,7 +216,7 @@
           <w:color w:val="444444"/>
           <w:sz w:val="20"/>
         </w:rPr>
-        <w:t xml:space="preserve"> An insurer's requirement that a doctor get approval before a treatment or prescription is covered. AB463 (2025) sets rules and deadlines for it.</w:t>
+        <w:t xml:space="preserve"> An insurer's requirement that a doctor get approval before a treatment or prescription is covered.</w:t>
       </w:r>
     </w:p>
     <w:p>
@@ -612,7 +242,7 @@
           <w:color w:val="444444"/>
           <w:sz w:val="20"/>
         </w:rPr>
-        <w:t xml:space="preserve"> An insurer's requirement that a patient try cheaper drugs first and "fail" on them before the prescribed one is covered; limited in 2023 (SB167, SB194).</w:t>
+        <w:t xml:space="preserve"> An insurer's requirement that a patient try cheaper drugs first — and "fail" on them — before the prescribed one is covered.</w:t>
       </w:r>
     </w:p>
     <w:p>
@@ -638,7 +268,7 @@
           <w:color w:val="444444"/>
           <w:sz w:val="20"/>
         </w:rPr>
-        <w:t xml:space="preserve"> An agreement among states to honor each other's professional licenses, so a nurse or therapist licensed in one member state can practice in the others. The </w:t>
+        <w:t xml:space="preserve"> An agreement among states to honor each other's professional licenses, so a provider licensed in one member state can practice in the others. The </w:t>
       </w:r>
       <w:r>
         <w:rPr>
@@ -708,7 +338,7 @@
           <w:color w:val="444444"/>
           <w:sz w:val="20"/>
         </w:rPr>
-        <w:t xml:space="preserve"> The set of providers under contract with an insurer. A provider whose "panel is full" is not accepting new patients; no Nevada law defines when a panel counts as full.</w:t>
+        <w:t xml:space="preserve"> The providers under contract with an insurer. A provider whose "panel is full" is not accepting new patients; no Nevada law defines when a panel counts as full.</w:t>
       </w:r>
     </w:p>
     <w:p>
@@ -760,7 +390,7 @@
           <w:color w:val="444444"/>
           <w:sz w:val="20"/>
         </w:rPr>
-        <w:t xml:space="preserve"> A neutral process that settles a payment dispute between insurer and provider outside court; SB497 (2023) built Nevada's system for emergency-billing disputes. </w:t>
+        <w:t xml:space="preserve"> A neutral process that settles insurer–provider payment disputes outside court. </w:t>
       </w:r>
       <w:r>
         <w:rPr>
@@ -804,7 +434,7 @@
           <w:color w:val="444444"/>
           <w:sz w:val="20"/>
         </w:rPr>
-        <w:t xml:space="preserve"> Emergency room versus walk-in clinic. ER visits carry hospital-level charges even for minor problems, which is why participants proposed splitting the billing.</w:t>
+        <w:t xml:space="preserve"> Emergency room versus walk-in clinic. ER visits carry hospital-level charges even for minor problems — why participants proposed splitting the billing.</w:t>
       </w:r>
     </w:p>
     <w:p>
@@ -830,7 +460,7 @@
           <w:color w:val="444444"/>
           <w:sz w:val="20"/>
         </w:rPr>
-        <w:t xml:space="preserve"> Medical care delivered by video or phone; settled Nevada law since 2021.</w:t>
+        <w:t xml:space="preserve"> Medical care delivered by video or phone; settled Nevada law.</w:t>
       </w:r>
     </w:p>
     <w:p>
@@ -856,7 +486,7 @@
           <w:color w:val="444444"/>
           <w:sz w:val="20"/>
         </w:rPr>
-        <w:t xml:space="preserve"> What an insurer or government program pays a provider for a service. Low rates are why some providers do not accept Medicaid patients.</w:t>
+        <w:t xml:space="preserve"> What an insurer or government program pays a provider. Low rates are why some providers do not accept Medicaid patients.</w:t>
       </w:r>
     </w:p>
     <w:p>
@@ -882,7 +512,7 @@
           <w:color w:val="444444"/>
           <w:sz w:val="20"/>
         </w:rPr>
-        <w:t xml:space="preserve"> A fee collected from providers and used to draw down federal matching money, funding higher Medicaid payments without state general-fund dollars (SB435, 2023).</w:t>
+        <w:t xml:space="preserve"> A fee collected from providers and used to draw down federal matching money — funding higher Medicaid payments without state general-fund dollars.</w:t>
       </w:r>
     </w:p>
     <w:p>
@@ -899,7 +529,7 @@
           <w:color w:val="1A2D4F"/>
           <w:sz w:val="20"/>
         </w:rPr>
-        <w:t>Medicaid.</w:t>
+        <w:t>Medicaid / CHIP.</w:t>
       </w:r>
       <w:r>
         <w:rPr>
@@ -908,25 +538,7 @@
           <w:color w:val="444444"/>
           <w:sz w:val="20"/>
         </w:rPr>
-        <w:t xml:space="preserve"> The state-federal insurance program for lower-income Nevadans; the state sets many of its rules, which is why so many bills target it. </w:t>
-      </w:r>
-      <w:r>
-        <w:rPr>
-          <w:rFonts w:ascii="Arial" w:hAnsi="Arial" w:cs="Arial" w:eastAsia="Arial"/>
-          <w:b/>
-          <w:color w:val="1A2D4F"/>
-          <w:sz w:val="20"/>
-        </w:rPr>
-        <w:t>CHIP</w:t>
-      </w:r>
-      <w:r>
-        <w:rPr>
-          <w:rFonts w:ascii="Arial" w:hAnsi="Arial" w:cs="Arial" w:eastAsia="Arial"/>
-          <w:b w:val="0"/>
-          <w:color w:val="444444"/>
-          <w:sz w:val="20"/>
-        </w:rPr>
-        <w:t xml:space="preserve"> is its companion program for children.</w:t>
+        <w:t xml:space="preserve"> The state-federal insurance program for lower-income Nevadans, and its companion program for children. The state sets many of its rules, which is why so many bills target it.</w:t>
       </w:r>
     </w:p>
     <w:p>
@@ -952,7 +564,7 @@
           <w:color w:val="444444"/>
           <w:sz w:val="20"/>
         </w:rPr>
-        <w:t xml:space="preserve"> The federal insurance program for people 65 and over and some people with disabilities. Its payment rates and drug prices are set federally — no Nevada bill can change them.</w:t>
+        <w:t xml:space="preserve"> The federal insurance program for people 65 and over and some people with disabilities. Its payment rates and drug prices are set federally.</w:t>
       </w:r>
     </w:p>
     <w:p>
@@ -1004,7 +616,7 @@
           <w:color w:val="444444"/>
           <w:sz w:val="20"/>
         </w:rPr>
-        <w:t xml:space="preserve"> A state-designed health plan any Nevadan can buy (SB420, 2021).</w:t>
+        <w:t xml:space="preserve"> A state-designed health plan any Nevadan can buy.</w:t>
       </w:r>
     </w:p>
     <w:p>
@@ -1030,7 +642,7 @@
           <w:color w:val="444444"/>
           <w:sz w:val="20"/>
         </w:rPr>
-        <w:t xml:space="preserve"> Letting small businesses or unrelated groups band together to buy insurance at large-group prices — the design participants sketched that has never been filed.</w:t>
+        <w:t xml:space="preserve"> Letting small businesses or unrelated groups band together to buy insurance at large-group prices — never filed as a bill.</w:t>
       </w:r>
     </w:p>
     <w:p>
@@ -1056,7 +668,7 @@
           <w:color w:val="444444"/>
           <w:sz w:val="20"/>
         </w:rPr>
-        <w:t xml:space="preserve"> A plan in which the employer pays claims itself and an insurer only administers the paperwork. Most large-employer coverage works this way — and it is beyond state regulation (see ERISA below).</w:t>
+        <w:t xml:space="preserve"> A plan where the employer pays claims itself and an insurer only administers paperwork. Most large-employer coverage works this way — and it is beyond state regulation (see ERISA).</w:t>
       </w:r>
     </w:p>
     <w:p>
@@ -1108,7 +720,7 @@
           <w:color w:val="444444"/>
           <w:sz w:val="20"/>
         </w:rPr>
-        <w:t xml:space="preserve"> The years of supervised hospital training after medical school. Residency slots are the bottleneck for growing the doctor supply, which is why Nevada created residency grants (SB350, 2023).</w:t>
+        <w:t xml:space="preserve"> The years of supervised hospital training after medical school — the bottleneck for growing the doctor supply, and the target of Nevada's residency grants.</w:t>
       </w:r>
     </w:p>
     <w:p>
@@ -1134,7 +746,7 @@
           <w:color w:val="444444"/>
           <w:sz w:val="20"/>
         </w:rPr>
-        <w:t xml:space="preserve"> Doctors trained abroad; SB124 (2025) eased their path to full Nevada licensure.</w:t>
+        <w:t xml:space="preserve"> Doctors trained abroad, whose path to full Nevada licensure was eased in 2025.</w:t>
       </w:r>
     </w:p>
     <w:p>
@@ -1160,7 +772,7 @@
           <w:color w:val="444444"/>
           <w:sz w:val="20"/>
         </w:rPr>
-        <w:t xml:space="preserve"> The front-line providers of behavioral therapy for autistic children; their Medicaid rates were raised in 2021 (SB96).</w:t>
+        <w:t xml:space="preserve"> Front-line providers of behavioral therapy for autistic children.</w:t>
       </w:r>
     </w:p>
     <w:p>
@@ -1186,7 +798,7 @@
           <w:color w:val="444444"/>
           <w:sz w:val="20"/>
         </w:rPr>
-        <w:t xml:space="preserve"> A licensed midlevel dental profession — more training than a hygienist, less than a dentist — created in Nevada in 2019.</w:t>
+        <w:t xml:space="preserve"> A licensed midlevel dental profession — more training than a hygienist, less than a dentist.</w:t>
       </w:r>
     </w:p>
     <w:p>
@@ -1238,7 +850,7 @@
           <w:color w:val="444444"/>
           <w:sz w:val="20"/>
         </w:rPr>
-        <w:t xml:space="preserve"> The new state agency that consolidates Nevada's public health-insurance programs (SB494, 2025).</w:t>
+        <w:t xml:space="preserve"> The new state agency that consolidates Nevada's public health-insurance programs.</w:t>
       </w:r>
     </w:p>
     <w:p>
@@ -1264,7 +876,7 @@
           <w:color w:val="444444"/>
           <w:sz w:val="20"/>
         </w:rPr>
-        <w:t xml:space="preserve"> The Statewide Health Care Access and Recruitment Grant Program — competitive grants aimed at critical provider shortages, enacted as SB5 of the 2025 special session.</w:t>
+        <w:t xml:space="preserve"> Competitive state grants aimed at critical provider shortages, enacted in the 2025 special session.</w:t>
       </w:r>
     </w:p>
     <w:p>
@@ -1322,7 +934,7 @@
           <w:color w:val="444444"/>
           <w:sz w:val="20"/>
         </w:rPr>
-        <w:t xml:space="preserve"> The federal law, in force since 2022, that protects patients nationwide from surprise out-of-network emergency bills.</w:t>
+        <w:t xml:space="preserve"> The federal law, in force since 2022, protecting patients nationwide from surprise out-of-network emergency bills.</w:t>
       </w:r>
     </w:p>
     <w:p>
@@ -1348,7 +960,7 @@
           <w:color w:val="444444"/>
           <w:sz w:val="20"/>
         </w:rPr>
-        <w:t xml:space="preserve"> Drug prices the federal government negotiates directly with manufacturers under a 2022 law; the first negotiated prices take effect in 2026. Nevada's vetoed price caps were pegged to these prices.</w:t>
+        <w:t xml:space="preserve"> Drug prices the federal government negotiates directly with manufacturers under a 2022 law; the first take effect in 2026. Nevada's vetoed price caps were pegged to them.</w:t>
       </w:r>
     </w:p>
     <w:p>
@@ -1374,7 +986,7 @@
           <w:color w:val="444444"/>
           <w:sz w:val="20"/>
         </w:rPr>
-        <w:t xml:space="preserve"> Rules finalized in 2024 that impose decision deadlines on Medicare Advantage, Medicaid, and exchange plans through 2027; AB463 covers the state-regulated plans these rules do not reach.</w:t>
+        <w:t xml:space="preserve"> Rules finalized in 2024 imposing decision deadlines on Medicare Advantage, Medicaid, and exchange plans through 2027; Nevada's law covers the state-regulated plans they do not reach.</w:t>
       </w:r>
     </w:p>
     <w:p>
@@ -1400,7 +1012,7 @@
           <w:color w:val="444444"/>
           <w:sz w:val="20"/>
         </w:rPr>
-        <w:t xml:space="preserve"> The federal Employee Retirement Income Security Act, which puts self-funded employer health plans under federal — not state — regulation. State bills cannot reach the employer coverage most workers have.</w:t>
+        <w:t xml:space="preserve"> The federal Employee Retirement Income Security Act, which puts self-funded employer health plans under federal — not state — regulation.</w:t>
       </w:r>
     </w:p>
     <w:p>
@@ -1458,7 +1070,7 @@
           <w:color w:val="444444"/>
           <w:sz w:val="20"/>
         </w:rPr>
-        <w:t xml:space="preserve"> Assembly Bill / Senate Bill — the chamber a bill started in, plus its number. Numbering restarts every session, so SB497 (2023) and SB497 (2025) are different bills.</w:t>
+        <w:t xml:space="preserve"> Assembly Bill / Senate Bill — the chamber a bill started in, plus its number. Numbering restarts every session, so the same number in different years is a different bill.</w:t>
       </w:r>
     </w:p>
     <w:p>

</xml_diff>

<commit_message>
Glossaries v2.0: Issue Brief 5 glossary organization — alphabetized two-column Term: entries plus embedded process guide
Co-authored-by: CaptainWrechols <CaptainWrechols@users.noreply.github.com>
</commit_message>
<xml_diff>
--- a/briefs/nevada/cost-of-living/citizen-v3/glossary.docx
+++ b/briefs/nevada/cost-of-living/citizen-v3/glossary.docx
@@ -54,7 +54,1223 @@
           <w:color w:val="444444"/>
           <w:sz w:val="20"/>
         </w:rPr>
-        <w:t>Plain-language definitions for the terms and acronyms in "The Rising Cost of Living in Nevada: Health Care" (citizen brief v3.0). Lawmaking-process terms are in the shared companion, "How Nevada Lawmaking Works."</w:t>
+        <w:t>Plain-language definitions of the terms and acronyms in "The Rising Cost of Living in Nevada: Health Care" (citizen brief v3.0), followed by the legislative process guide shared by all four briefs.</w:t>
+      </w:r>
+    </w:p>
+    <w:p>
+      <w:pPr>
+        <w:sectPr>
+          <w:pgSz w:w="12240" w:h="15840"/>
+          <w:pgMar w:top="864" w:right="864" w:bottom="864" w:left="864" w:header="720" w:footer="720" w:gutter="0"/>
+          <w:cols w:space="720"/>
+          <w:docGrid w:linePitch="360"/>
+        </w:sectPr>
+      </w:pPr>
+    </w:p>
+    <w:p>
+      <w:pPr>
+        <w:widowControl/>
+        <w:spacing w:before="100" w:after="40" w:lineRule="auto" w:line="254"/>
+      </w:pPr>
+      <w:r>
+        <w:rPr>
+          <w:rFonts w:ascii="Arial" w:hAnsi="Arial" w:cs="Arial" w:eastAsia="Arial"/>
+          <w:b/>
+          <w:color w:val="C0392B"/>
+          <w:sz w:val="25"/>
+          <w:spacing w:val="20"/>
+        </w:rPr>
+        <w:t>GLOSSARY</w:t>
+      </w:r>
+    </w:p>
+    <w:p>
+      <w:pPr>
+        <w:widowControl/>
+        <w:spacing w:before="0" w:after="60" w:lineRule="auto" w:line="252"/>
+        <w:ind w:left="200"/>
+      </w:pPr>
+      <w:r>
+        <w:rPr>
+          <w:rFonts w:ascii="Arial" w:hAnsi="Arial" w:cs="Arial" w:eastAsia="Arial"/>
+          <w:b w:val="0"/>
+          <w:color w:val="C0392B"/>
+          <w:sz w:val="20"/>
+        </w:rPr>
+        <w:t xml:space="preserve">▪  </w:t>
+      </w:r>
+      <w:r>
+        <w:rPr>
+          <w:rFonts w:ascii="Arial" w:hAnsi="Arial" w:cs="Arial" w:eastAsia="Arial"/>
+          <w:b/>
+          <w:color w:val="1A2D4F"/>
+          <w:sz w:val="20"/>
+        </w:rPr>
+        <w:t>340B:</w:t>
+      </w:r>
+      <w:r>
+        <w:rPr>
+          <w:rFonts w:ascii="Arial" w:hAnsi="Arial" w:cs="Arial" w:eastAsia="Arial"/>
+          <w:b w:val="0"/>
+          <w:color w:val="444444"/>
+          <w:sz w:val="20"/>
+        </w:rPr>
+        <w:t xml:space="preserve"> A federal program letting hospitals and clinics serving low-income patients buy drugs at deep discounts.</w:t>
+      </w:r>
+    </w:p>
+    <w:p>
+      <w:pPr>
+        <w:widowControl/>
+        <w:spacing w:before="0" w:after="60" w:lineRule="auto" w:line="252"/>
+        <w:ind w:left="200"/>
+      </w:pPr>
+      <w:r>
+        <w:rPr>
+          <w:rFonts w:ascii="Arial" w:hAnsi="Arial" w:cs="Arial" w:eastAsia="Arial"/>
+          <w:b w:val="0"/>
+          <w:color w:val="C0392B"/>
+          <w:sz w:val="20"/>
+        </w:rPr>
+        <w:t xml:space="preserve">▪  </w:t>
+      </w:r>
+      <w:r>
+        <w:rPr>
+          <w:rFonts w:ascii="Arial" w:hAnsi="Arial" w:cs="Arial" w:eastAsia="Arial"/>
+          <w:b/>
+          <w:color w:val="1A2D4F"/>
+          <w:sz w:val="20"/>
+        </w:rPr>
+        <w:t>Any-group pooling:</w:t>
+      </w:r>
+      <w:r>
+        <w:rPr>
+          <w:rFonts w:ascii="Arial" w:hAnsi="Arial" w:cs="Arial" w:eastAsia="Arial"/>
+          <w:b w:val="0"/>
+          <w:color w:val="444444"/>
+          <w:sz w:val="20"/>
+        </w:rPr>
+        <w:t xml:space="preserve"> Letting small businesses or unrelated groups band together to buy insurance at large-group prices — never filed.</w:t>
+      </w:r>
+    </w:p>
+    <w:p>
+      <w:pPr>
+        <w:widowControl/>
+        <w:spacing w:before="0" w:after="60" w:lineRule="auto" w:line="252"/>
+        <w:ind w:left="200"/>
+      </w:pPr>
+      <w:r>
+        <w:rPr>
+          <w:rFonts w:ascii="Arial" w:hAnsi="Arial" w:cs="Arial" w:eastAsia="Arial"/>
+          <w:b w:val="0"/>
+          <w:color w:val="C0392B"/>
+          <w:sz w:val="20"/>
+        </w:rPr>
+        <w:t xml:space="preserve">▪  </w:t>
+      </w:r>
+      <w:r>
+        <w:rPr>
+          <w:rFonts w:ascii="Arial" w:hAnsi="Arial" w:cs="Arial" w:eastAsia="Arial"/>
+          <w:b/>
+          <w:color w:val="1A2D4F"/>
+          <w:sz w:val="20"/>
+        </w:rPr>
+        <w:t>Arbitration:</w:t>
+      </w:r>
+      <w:r>
+        <w:rPr>
+          <w:rFonts w:ascii="Arial" w:hAnsi="Arial" w:cs="Arial" w:eastAsia="Arial"/>
+          <w:b w:val="0"/>
+          <w:color w:val="444444"/>
+          <w:sz w:val="20"/>
+        </w:rPr>
+        <w:t xml:space="preserve"> A neutral process settling insurer–provider payment disputes outside court; forced arbitration — the vetoed-bill subject — is a policy clause stripping the patient's right to sue.</w:t>
+      </w:r>
+    </w:p>
+    <w:p>
+      <w:pPr>
+        <w:widowControl/>
+        <w:spacing w:before="0" w:after="60" w:lineRule="auto" w:line="252"/>
+        <w:ind w:left="200"/>
+      </w:pPr>
+      <w:r>
+        <w:rPr>
+          <w:rFonts w:ascii="Arial" w:hAnsi="Arial" w:cs="Arial" w:eastAsia="Arial"/>
+          <w:b w:val="0"/>
+          <w:color w:val="C0392B"/>
+          <w:sz w:val="20"/>
+        </w:rPr>
+        <w:t xml:space="preserve">▪  </w:t>
+      </w:r>
+      <w:r>
+        <w:rPr>
+          <w:rFonts w:ascii="Arial" w:hAnsi="Arial" w:cs="Arial" w:eastAsia="Arial"/>
+          <w:b/>
+          <w:color w:val="1A2D4F"/>
+          <w:sz w:val="20"/>
+        </w:rPr>
+        <w:t>Autism behavior technicians:</w:t>
+      </w:r>
+      <w:r>
+        <w:rPr>
+          <w:rFonts w:ascii="Arial" w:hAnsi="Arial" w:cs="Arial" w:eastAsia="Arial"/>
+          <w:b w:val="0"/>
+          <w:color w:val="444444"/>
+          <w:sz w:val="20"/>
+        </w:rPr>
+        <w:t xml:space="preserve"> Front-line providers of behavioral therapy for autistic children.</w:t>
+      </w:r>
+    </w:p>
+    <w:p>
+      <w:pPr>
+        <w:widowControl/>
+        <w:spacing w:before="0" w:after="60" w:lineRule="auto" w:line="252"/>
+        <w:ind w:left="200"/>
+      </w:pPr>
+      <w:r>
+        <w:rPr>
+          <w:rFonts w:ascii="Arial" w:hAnsi="Arial" w:cs="Arial" w:eastAsia="Arial"/>
+          <w:b w:val="0"/>
+          <w:color w:val="C0392B"/>
+          <w:sz w:val="20"/>
+        </w:rPr>
+        <w:t xml:space="preserve">▪  </w:t>
+      </w:r>
+      <w:r>
+        <w:rPr>
+          <w:rFonts w:ascii="Arial" w:hAnsi="Arial" w:cs="Arial" w:eastAsia="Arial"/>
+          <w:b/>
+          <w:color w:val="1A2D4F"/>
+          <w:sz w:val="20"/>
+        </w:rPr>
+        <w:t>Credentialing:</w:t>
+      </w:r>
+      <w:r>
+        <w:rPr>
+          <w:rFonts w:ascii="Arial" w:hAnsi="Arial" w:cs="Arial" w:eastAsia="Arial"/>
+          <w:b w:val="0"/>
+          <w:color w:val="444444"/>
+          <w:sz w:val="20"/>
+        </w:rPr>
+        <w:t xml:space="preserve"> An insurer's vetting process for adding a provider to its network; slow credentialing keeps new providers from insured patients for months.</w:t>
+      </w:r>
+    </w:p>
+    <w:p>
+      <w:pPr>
+        <w:widowControl/>
+        <w:spacing w:before="0" w:after="60" w:lineRule="auto" w:line="252"/>
+        <w:ind w:left="200"/>
+      </w:pPr>
+      <w:r>
+        <w:rPr>
+          <w:rFonts w:ascii="Arial" w:hAnsi="Arial" w:cs="Arial" w:eastAsia="Arial"/>
+          <w:b w:val="0"/>
+          <w:color w:val="C0392B"/>
+          <w:sz w:val="20"/>
+        </w:rPr>
+        <w:t xml:space="preserve">▪  </w:t>
+      </w:r>
+      <w:r>
+        <w:rPr>
+          <w:rFonts w:ascii="Arial" w:hAnsi="Arial" w:cs="Arial" w:eastAsia="Arial"/>
+          <w:b/>
+          <w:color w:val="1A2D4F"/>
+          <w:sz w:val="20"/>
+        </w:rPr>
+        <w:t>Dental therapy:</w:t>
+      </w:r>
+      <w:r>
+        <w:rPr>
+          <w:rFonts w:ascii="Arial" w:hAnsi="Arial" w:cs="Arial" w:eastAsia="Arial"/>
+          <w:b w:val="0"/>
+          <w:color w:val="444444"/>
+          <w:sz w:val="20"/>
+        </w:rPr>
+        <w:t xml:space="preserve"> A licensed midlevel dental profession — more training than a hygienist, less than a dentist.</w:t>
+      </w:r>
+    </w:p>
+    <w:p>
+      <w:pPr>
+        <w:widowControl/>
+        <w:spacing w:before="0" w:after="60" w:lineRule="auto" w:line="252"/>
+        <w:ind w:left="200"/>
+      </w:pPr>
+      <w:r>
+        <w:rPr>
+          <w:rFonts w:ascii="Arial" w:hAnsi="Arial" w:cs="Arial" w:eastAsia="Arial"/>
+          <w:b w:val="0"/>
+          <w:color w:val="C0392B"/>
+          <w:sz w:val="20"/>
+        </w:rPr>
+        <w:t xml:space="preserve">▪  </w:t>
+      </w:r>
+      <w:r>
+        <w:rPr>
+          <w:rFonts w:ascii="Arial" w:hAnsi="Arial" w:cs="Arial" w:eastAsia="Arial"/>
+          <w:b/>
+          <w:color w:val="1A2D4F"/>
+          <w:sz w:val="20"/>
+        </w:rPr>
+        <w:t>EMS:</w:t>
+      </w:r>
+      <w:r>
+        <w:rPr>
+          <w:rFonts w:ascii="Arial" w:hAnsi="Arial" w:cs="Arial" w:eastAsia="Arial"/>
+          <w:b w:val="0"/>
+          <w:color w:val="444444"/>
+          <w:sz w:val="20"/>
+        </w:rPr>
+        <w:t xml:space="preserve"> Emergency medical services — ambulance and paramedic personnel.</w:t>
+      </w:r>
+    </w:p>
+    <w:p>
+      <w:pPr>
+        <w:widowControl/>
+        <w:spacing w:before="0" w:after="60" w:lineRule="auto" w:line="252"/>
+        <w:ind w:left="200"/>
+      </w:pPr>
+      <w:r>
+        <w:rPr>
+          <w:rFonts w:ascii="Arial" w:hAnsi="Arial" w:cs="Arial" w:eastAsia="Arial"/>
+          <w:b w:val="0"/>
+          <w:color w:val="C0392B"/>
+          <w:sz w:val="20"/>
+        </w:rPr>
+        <w:t xml:space="preserve">▪  </w:t>
+      </w:r>
+      <w:r>
+        <w:rPr>
+          <w:rFonts w:ascii="Arial" w:hAnsi="Arial" w:cs="Arial" w:eastAsia="Arial"/>
+          <w:b/>
+          <w:color w:val="1A2D4F"/>
+          <w:sz w:val="20"/>
+        </w:rPr>
+        <w:t>ER / urgent care:</w:t>
+      </w:r>
+      <w:r>
+        <w:rPr>
+          <w:rFonts w:ascii="Arial" w:hAnsi="Arial" w:cs="Arial" w:eastAsia="Arial"/>
+          <w:b w:val="0"/>
+          <w:color w:val="444444"/>
+          <w:sz w:val="20"/>
+        </w:rPr>
+        <w:t xml:space="preserve"> Emergency room versus walk-in clinic; ER visits carry hospital-level charges even for minor problems — why participants proposed splitting the billing.</w:t>
+      </w:r>
+    </w:p>
+    <w:p>
+      <w:pPr>
+        <w:widowControl/>
+        <w:spacing w:before="0" w:after="60" w:lineRule="auto" w:line="252"/>
+        <w:ind w:left="200"/>
+      </w:pPr>
+      <w:r>
+        <w:rPr>
+          <w:rFonts w:ascii="Arial" w:hAnsi="Arial" w:cs="Arial" w:eastAsia="Arial"/>
+          <w:b w:val="0"/>
+          <w:color w:val="C0392B"/>
+          <w:sz w:val="20"/>
+        </w:rPr>
+        <w:t xml:space="preserve">▪  </w:t>
+      </w:r>
+      <w:r>
+        <w:rPr>
+          <w:rFonts w:ascii="Arial" w:hAnsi="Arial" w:cs="Arial" w:eastAsia="Arial"/>
+          <w:b/>
+          <w:color w:val="1A2D4F"/>
+          <w:sz w:val="20"/>
+        </w:rPr>
+        <w:t>ERISA:</w:t>
+      </w:r>
+      <w:r>
+        <w:rPr>
+          <w:rFonts w:ascii="Arial" w:hAnsi="Arial" w:cs="Arial" w:eastAsia="Arial"/>
+          <w:b w:val="0"/>
+          <w:color w:val="444444"/>
+          <w:sz w:val="20"/>
+        </w:rPr>
+        <w:t xml:space="preserve"> The federal Employee Retirement Income Security Act, which puts self-funded employer health plans under federal — not state — regulation.</w:t>
+      </w:r>
+    </w:p>
+    <w:p>
+      <w:pPr>
+        <w:widowControl/>
+        <w:spacing w:before="0" w:after="60" w:lineRule="auto" w:line="252"/>
+        <w:ind w:left="200"/>
+      </w:pPr>
+      <w:r>
+        <w:rPr>
+          <w:rFonts w:ascii="Arial" w:hAnsi="Arial" w:cs="Arial" w:eastAsia="Arial"/>
+          <w:b w:val="0"/>
+          <w:color w:val="C0392B"/>
+          <w:sz w:val="20"/>
+        </w:rPr>
+        <w:t xml:space="preserve">▪  </w:t>
+      </w:r>
+      <w:r>
+        <w:rPr>
+          <w:rFonts w:ascii="Arial" w:hAnsi="Arial" w:cs="Arial" w:eastAsia="Arial"/>
+          <w:b/>
+          <w:color w:val="1A2D4F"/>
+          <w:sz w:val="20"/>
+        </w:rPr>
+        <w:t>Federal prior-authorization rules:</w:t>
+      </w:r>
+      <w:r>
+        <w:rPr>
+          <w:rFonts w:ascii="Arial" w:hAnsi="Arial" w:cs="Arial" w:eastAsia="Arial"/>
+          <w:b w:val="0"/>
+          <w:color w:val="444444"/>
+          <w:sz w:val="20"/>
+        </w:rPr>
+        <w:t xml:space="preserve"> 2024 federal rules imposing decision deadlines on Medicare Advantage, Medicaid, and exchange plans through 2027; Nevada's law covers the plans they miss.</w:t>
+      </w:r>
+    </w:p>
+    <w:p>
+      <w:pPr>
+        <w:widowControl/>
+        <w:spacing w:before="0" w:after="60" w:lineRule="auto" w:line="252"/>
+        <w:ind w:left="200"/>
+      </w:pPr>
+      <w:r>
+        <w:rPr>
+          <w:rFonts w:ascii="Arial" w:hAnsi="Arial" w:cs="Arial" w:eastAsia="Arial"/>
+          <w:b w:val="0"/>
+          <w:color w:val="C0392B"/>
+          <w:sz w:val="20"/>
+        </w:rPr>
+        <w:t xml:space="preserve">▪  </w:t>
+      </w:r>
+      <w:r>
+        <w:rPr>
+          <w:rFonts w:ascii="Arial" w:hAnsi="Arial" w:cs="Arial" w:eastAsia="Arial"/>
+          <w:b/>
+          <w:color w:val="1A2D4F"/>
+          <w:sz w:val="20"/>
+        </w:rPr>
+        <w:t>Foreign medical graduates:</w:t>
+      </w:r>
+      <w:r>
+        <w:rPr>
+          <w:rFonts w:ascii="Arial" w:hAnsi="Arial" w:cs="Arial" w:eastAsia="Arial"/>
+          <w:b w:val="0"/>
+          <w:color w:val="444444"/>
+          <w:sz w:val="20"/>
+        </w:rPr>
+        <w:t xml:space="preserve"> Doctors trained abroad, whose path to full Nevada licensure was eased in 2025.</w:t>
+      </w:r>
+    </w:p>
+    <w:p>
+      <w:pPr>
+        <w:widowControl/>
+        <w:spacing w:before="0" w:after="60" w:lineRule="auto" w:line="252"/>
+        <w:ind w:left="200"/>
+      </w:pPr>
+      <w:r>
+        <w:rPr>
+          <w:rFonts w:ascii="Arial" w:hAnsi="Arial" w:cs="Arial" w:eastAsia="Arial"/>
+          <w:b w:val="0"/>
+          <w:color w:val="C0392B"/>
+          <w:sz w:val="20"/>
+        </w:rPr>
+        <w:t xml:space="preserve">▪  </w:t>
+      </w:r>
+      <w:r>
+        <w:rPr>
+          <w:rFonts w:ascii="Arial" w:hAnsi="Arial" w:cs="Arial" w:eastAsia="Arial"/>
+          <w:b/>
+          <w:color w:val="1A2D4F"/>
+          <w:sz w:val="20"/>
+        </w:rPr>
+        <w:t>Gag clause:</w:t>
+      </w:r>
+      <w:r>
+        <w:rPr>
+          <w:rFonts w:ascii="Arial" w:hAnsi="Arial" w:cs="Arial" w:eastAsia="Arial"/>
+          <w:b w:val="0"/>
+          <w:color w:val="444444"/>
+          <w:sz w:val="20"/>
+        </w:rPr>
+        <w:t xml:space="preserve"> A contract term barring pharmacists from volunteering that paying cash would be cheaper than insurance; now banned in Nevada.</w:t>
+      </w:r>
+    </w:p>
+    <w:p>
+      <w:pPr>
+        <w:widowControl/>
+        <w:spacing w:before="0" w:after="60" w:lineRule="auto" w:line="252"/>
+        <w:ind w:left="200"/>
+      </w:pPr>
+      <w:r>
+        <w:rPr>
+          <w:rFonts w:ascii="Arial" w:hAnsi="Arial" w:cs="Arial" w:eastAsia="Arial"/>
+          <w:b w:val="0"/>
+          <w:color w:val="C0392B"/>
+          <w:sz w:val="20"/>
+        </w:rPr>
+        <w:t xml:space="preserve">▪  </w:t>
+      </w:r>
+      <w:r>
+        <w:rPr>
+          <w:rFonts w:ascii="Arial" w:hAnsi="Arial" w:cs="Arial" w:eastAsia="Arial"/>
+          <w:b/>
+          <w:color w:val="1A2D4F"/>
+          <w:sz w:val="20"/>
+        </w:rPr>
+        <w:t>Health Service Corps:</w:t>
+      </w:r>
+      <w:r>
+        <w:rPr>
+          <w:rFonts w:ascii="Arial" w:hAnsi="Arial" w:cs="Arial" w:eastAsia="Arial"/>
+          <w:b w:val="0"/>
+          <w:color w:val="444444"/>
+          <w:sz w:val="20"/>
+        </w:rPr>
+        <w:t xml:space="preserve"> Nevada's loan-repayment program for providers who commit to underserved areas.</w:t>
+      </w:r>
+    </w:p>
+    <w:p>
+      <w:pPr>
+        <w:widowControl/>
+        <w:spacing w:before="0" w:after="60" w:lineRule="auto" w:line="252"/>
+        <w:ind w:left="200"/>
+      </w:pPr>
+      <w:r>
+        <w:rPr>
+          <w:rFonts w:ascii="Arial" w:hAnsi="Arial" w:cs="Arial" w:eastAsia="Arial"/>
+          <w:b w:val="0"/>
+          <w:color w:val="C0392B"/>
+          <w:sz w:val="20"/>
+        </w:rPr>
+        <w:t xml:space="preserve">▪  </w:t>
+      </w:r>
+      <w:r>
+        <w:rPr>
+          <w:rFonts w:ascii="Arial" w:hAnsi="Arial" w:cs="Arial" w:eastAsia="Arial"/>
+          <w:b/>
+          <w:color w:val="1A2D4F"/>
+          <w:sz w:val="20"/>
+        </w:rPr>
+        <w:t>HHS:</w:t>
+      </w:r>
+      <w:r>
+        <w:rPr>
+          <w:rFonts w:ascii="Arial" w:hAnsi="Arial" w:cs="Arial" w:eastAsia="Arial"/>
+          <w:b w:val="0"/>
+          <w:color w:val="444444"/>
+          <w:sz w:val="20"/>
+        </w:rPr>
+        <w:t xml:space="preserve"> Health and Human Services, as in the Senate and Assembly HHS committees.</w:t>
+      </w:r>
+    </w:p>
+    <w:p>
+      <w:pPr>
+        <w:widowControl/>
+        <w:spacing w:before="0" w:after="60" w:lineRule="auto" w:line="252"/>
+        <w:ind w:left="200"/>
+      </w:pPr>
+      <w:r>
+        <w:rPr>
+          <w:rFonts w:ascii="Arial" w:hAnsi="Arial" w:cs="Arial" w:eastAsia="Arial"/>
+          <w:b w:val="0"/>
+          <w:color w:val="C0392B"/>
+          <w:sz w:val="20"/>
+        </w:rPr>
+        <w:t xml:space="preserve">▪  </w:t>
+      </w:r>
+      <w:r>
+        <w:rPr>
+          <w:rFonts w:ascii="Arial" w:hAnsi="Arial" w:cs="Arial" w:eastAsia="Arial"/>
+          <w:b/>
+          <w:color w:val="1A2D4F"/>
+          <w:sz w:val="20"/>
+        </w:rPr>
+        <w:t>Licensure compact:</w:t>
+      </w:r>
+      <w:r>
+        <w:rPr>
+          <w:rFonts w:ascii="Arial" w:hAnsi="Arial" w:cs="Arial" w:eastAsia="Arial"/>
+          <w:b w:val="0"/>
+          <w:color w:val="444444"/>
+          <w:sz w:val="20"/>
+        </w:rPr>
+        <w:t xml:space="preserve"> An agreement among states to honor each other's professional licenses across member states; the Nurse Licensure Compact is the nursing version — the one compact Nevada has not joined.</w:t>
+      </w:r>
+    </w:p>
+    <w:p>
+      <w:pPr>
+        <w:widowControl/>
+        <w:spacing w:before="0" w:after="60" w:lineRule="auto" w:line="252"/>
+        <w:ind w:left="200"/>
+      </w:pPr>
+      <w:r>
+        <w:rPr>
+          <w:rFonts w:ascii="Arial" w:hAnsi="Arial" w:cs="Arial" w:eastAsia="Arial"/>
+          <w:b w:val="0"/>
+          <w:color w:val="C0392B"/>
+          <w:sz w:val="20"/>
+        </w:rPr>
+        <w:t xml:space="preserve">▪  </w:t>
+      </w:r>
+      <w:r>
+        <w:rPr>
+          <w:rFonts w:ascii="Arial" w:hAnsi="Arial" w:cs="Arial" w:eastAsia="Arial"/>
+          <w:b/>
+          <w:color w:val="1A2D4F"/>
+          <w:sz w:val="20"/>
+        </w:rPr>
+        <w:t>Medicaid / CHIP:</w:t>
+      </w:r>
+      <w:r>
+        <w:rPr>
+          <w:rFonts w:ascii="Arial" w:hAnsi="Arial" w:cs="Arial" w:eastAsia="Arial"/>
+          <w:b w:val="0"/>
+          <w:color w:val="444444"/>
+          <w:sz w:val="20"/>
+        </w:rPr>
+        <w:t xml:space="preserve"> The state-federal insurance program for lower-income Nevadans and its companion Children's Health Insurance Program; the state sets many of its rules, so many bills target it.</w:t>
+      </w:r>
+    </w:p>
+    <w:p>
+      <w:pPr>
+        <w:widowControl/>
+        <w:spacing w:before="0" w:after="60" w:lineRule="auto" w:line="252"/>
+        <w:ind w:left="200"/>
+      </w:pPr>
+      <w:r>
+        <w:rPr>
+          <w:rFonts w:ascii="Arial" w:hAnsi="Arial" w:cs="Arial" w:eastAsia="Arial"/>
+          <w:b w:val="0"/>
+          <w:color w:val="C0392B"/>
+          <w:sz w:val="20"/>
+        </w:rPr>
+        <w:t xml:space="preserve">▪  </w:t>
+      </w:r>
+      <w:r>
+        <w:rPr>
+          <w:rFonts w:ascii="Arial" w:hAnsi="Arial" w:cs="Arial" w:eastAsia="Arial"/>
+          <w:b/>
+          <w:color w:val="1A2D4F"/>
+          <w:sz w:val="20"/>
+        </w:rPr>
+        <w:t>Medical-debt collection:</w:t>
+      </w:r>
+      <w:r>
+        <w:rPr>
+          <w:rFonts w:ascii="Arial" w:hAnsi="Arial" w:cs="Arial" w:eastAsia="Arial"/>
+          <w:b w:val="0"/>
+          <w:color w:val="444444"/>
+          <w:sz w:val="20"/>
+        </w:rPr>
+        <w:t xml:space="preserve"> Lawsuits, garnishments, and credit tactics used to collect unpaid medical bills; bills limiting them were vetoed.</w:t>
+      </w:r>
+    </w:p>
+    <w:p>
+      <w:pPr>
+        <w:widowControl/>
+        <w:spacing w:before="0" w:after="60" w:lineRule="auto" w:line="252"/>
+        <w:ind w:left="200"/>
+      </w:pPr>
+      <w:r>
+        <w:rPr>
+          <w:rFonts w:ascii="Arial" w:hAnsi="Arial" w:cs="Arial" w:eastAsia="Arial"/>
+          <w:b w:val="0"/>
+          <w:color w:val="C0392B"/>
+          <w:sz w:val="20"/>
+        </w:rPr>
+        <w:t xml:space="preserve">▪  </w:t>
+      </w:r>
+      <w:r>
+        <w:rPr>
+          <w:rFonts w:ascii="Arial" w:hAnsi="Arial" w:cs="Arial" w:eastAsia="Arial"/>
+          <w:b/>
+          <w:color w:val="1A2D4F"/>
+          <w:sz w:val="20"/>
+        </w:rPr>
+        <w:t>Medicare:</w:t>
+      </w:r>
+      <w:r>
+        <w:rPr>
+          <w:rFonts w:ascii="Arial" w:hAnsi="Arial" w:cs="Arial" w:eastAsia="Arial"/>
+          <w:b w:val="0"/>
+          <w:color w:val="444444"/>
+          <w:sz w:val="20"/>
+        </w:rPr>
+        <w:t xml:space="preserve"> The federal insurance program for people 65 and over and some with disabilities; its payment rates and drug prices are set federally.</w:t>
+      </w:r>
+    </w:p>
+    <w:p>
+      <w:pPr>
+        <w:widowControl/>
+        <w:spacing w:before="0" w:after="60" w:lineRule="auto" w:line="252"/>
+        <w:ind w:left="200"/>
+      </w:pPr>
+      <w:r>
+        <w:rPr>
+          <w:rFonts w:ascii="Arial" w:hAnsi="Arial" w:cs="Arial" w:eastAsia="Arial"/>
+          <w:b w:val="0"/>
+          <w:color w:val="C0392B"/>
+          <w:sz w:val="20"/>
+        </w:rPr>
+        <w:t xml:space="preserve">▪  </w:t>
+      </w:r>
+      <w:r>
+        <w:rPr>
+          <w:rFonts w:ascii="Arial" w:hAnsi="Arial" w:cs="Arial" w:eastAsia="Arial"/>
+          <w:b/>
+          <w:color w:val="1A2D4F"/>
+          <w:sz w:val="20"/>
+        </w:rPr>
+        <w:t>Medicare-negotiated prices:</w:t>
+      </w:r>
+      <w:r>
+        <w:rPr>
+          <w:rFonts w:ascii="Arial" w:hAnsi="Arial" w:cs="Arial" w:eastAsia="Arial"/>
+          <w:b w:val="0"/>
+          <w:color w:val="444444"/>
+          <w:sz w:val="20"/>
+        </w:rPr>
+        <w:t xml:space="preserve"> Drug prices the federal government negotiates with manufacturers under a 2022 law; the first take effect in 2026 — Nevada's vetoed caps were pegged to them.</w:t>
+      </w:r>
+    </w:p>
+    <w:p>
+      <w:pPr>
+        <w:widowControl/>
+        <w:spacing w:before="0" w:after="60" w:lineRule="auto" w:line="252"/>
+        <w:ind w:left="200"/>
+      </w:pPr>
+      <w:r>
+        <w:rPr>
+          <w:rFonts w:ascii="Arial" w:hAnsi="Arial" w:cs="Arial" w:eastAsia="Arial"/>
+          <w:b w:val="0"/>
+          <w:color w:val="C0392B"/>
+          <w:sz w:val="20"/>
+        </w:rPr>
+        <w:t xml:space="preserve">▪  </w:t>
+      </w:r>
+      <w:r>
+        <w:rPr>
+          <w:rFonts w:ascii="Arial" w:hAnsi="Arial" w:cs="Arial" w:eastAsia="Arial"/>
+          <w:b/>
+          <w:color w:val="1A2D4F"/>
+          <w:sz w:val="20"/>
+        </w:rPr>
+        <w:t>Network / panel:</w:t>
+      </w:r>
+      <w:r>
+        <w:rPr>
+          <w:rFonts w:ascii="Arial" w:hAnsi="Arial" w:cs="Arial" w:eastAsia="Arial"/>
+          <w:b w:val="0"/>
+          <w:color w:val="444444"/>
+          <w:sz w:val="20"/>
+        </w:rPr>
+        <w:t xml:space="preserve"> The providers under contract with an insurer; a provider whose "panel is full" is not accepting new patients, and no law defines when a panel is full.</w:t>
+      </w:r>
+    </w:p>
+    <w:p>
+      <w:pPr>
+        <w:widowControl/>
+        <w:spacing w:before="0" w:after="60" w:lineRule="auto" w:line="252"/>
+        <w:ind w:left="200"/>
+      </w:pPr>
+      <w:r>
+        <w:rPr>
+          <w:rFonts w:ascii="Arial" w:hAnsi="Arial" w:cs="Arial" w:eastAsia="Arial"/>
+          <w:b w:val="0"/>
+          <w:color w:val="C0392B"/>
+          <w:sz w:val="20"/>
+        </w:rPr>
+        <w:t xml:space="preserve">▪  </w:t>
+      </w:r>
+      <w:r>
+        <w:rPr>
+          <w:rFonts w:ascii="Arial" w:hAnsi="Arial" w:cs="Arial" w:eastAsia="Arial"/>
+          <w:b/>
+          <w:color w:val="1A2D4F"/>
+          <w:sz w:val="20"/>
+        </w:rPr>
+        <w:t>Nevada Health Authority:</w:t>
+      </w:r>
+      <w:r>
+        <w:rPr>
+          <w:rFonts w:ascii="Arial" w:hAnsi="Arial" w:cs="Arial" w:eastAsia="Arial"/>
+          <w:b w:val="0"/>
+          <w:color w:val="444444"/>
+          <w:sz w:val="20"/>
+        </w:rPr>
+        <w:t xml:space="preserve"> The new state agency consolidating Nevada's public health-insurance programs.</w:t>
+      </w:r>
+    </w:p>
+    <w:p>
+      <w:pPr>
+        <w:widowControl/>
+        <w:spacing w:before="0" w:after="60" w:lineRule="auto" w:line="252"/>
+        <w:ind w:left="200"/>
+      </w:pPr>
+      <w:r>
+        <w:rPr>
+          <w:rFonts w:ascii="Arial" w:hAnsi="Arial" w:cs="Arial" w:eastAsia="Arial"/>
+          <w:b w:val="0"/>
+          <w:color w:val="C0392B"/>
+          <w:sz w:val="20"/>
+        </w:rPr>
+        <w:t xml:space="preserve">▪  </w:t>
+      </w:r>
+      <w:r>
+        <w:rPr>
+          <w:rFonts w:ascii="Arial" w:hAnsi="Arial" w:cs="Arial" w:eastAsia="Arial"/>
+          <w:b/>
+          <w:color w:val="1A2D4F"/>
+          <w:sz w:val="20"/>
+        </w:rPr>
+        <w:t>No Surprises Act:</w:t>
+      </w:r>
+      <w:r>
+        <w:rPr>
+          <w:rFonts w:ascii="Arial" w:hAnsi="Arial" w:cs="Arial" w:eastAsia="Arial"/>
+          <w:b w:val="0"/>
+          <w:color w:val="444444"/>
+          <w:sz w:val="20"/>
+        </w:rPr>
+        <w:t xml:space="preserve"> The 2022 federal law protecting patients nationwide from surprise out-of-network emergency bills.</w:t>
+      </w:r>
+    </w:p>
+    <w:p>
+      <w:pPr>
+        <w:widowControl/>
+        <w:spacing w:before="0" w:after="60" w:lineRule="auto" w:line="252"/>
+        <w:ind w:left="200"/>
+      </w:pPr>
+      <w:r>
+        <w:rPr>
+          <w:rFonts w:ascii="Arial" w:hAnsi="Arial" w:cs="Arial" w:eastAsia="Arial"/>
+          <w:b w:val="0"/>
+          <w:color w:val="C0392B"/>
+          <w:sz w:val="20"/>
+        </w:rPr>
+        <w:t xml:space="preserve">▪  </w:t>
+      </w:r>
+      <w:r>
+        <w:rPr>
+          <w:rFonts w:ascii="Arial" w:hAnsi="Arial" w:cs="Arial" w:eastAsia="Arial"/>
+          <w:b/>
+          <w:color w:val="1A2D4F"/>
+          <w:sz w:val="20"/>
+        </w:rPr>
+        <w:t>Out-of-network:</w:t>
+      </w:r>
+      <w:r>
+        <w:rPr>
+          <w:rFonts w:ascii="Arial" w:hAnsi="Arial" w:cs="Arial" w:eastAsia="Arial"/>
+          <w:b w:val="0"/>
+          <w:color w:val="444444"/>
+          <w:sz w:val="20"/>
+        </w:rPr>
+        <w:t xml:space="preserve"> A provider with no contract with the patient's insurer — the source of the highest surprise bills.</w:t>
+      </w:r>
+    </w:p>
+    <w:p>
+      <w:pPr>
+        <w:widowControl/>
+        <w:spacing w:before="0" w:after="60" w:lineRule="auto" w:line="252"/>
+        <w:ind w:left="200"/>
+      </w:pPr>
+      <w:r>
+        <w:rPr>
+          <w:rFonts w:ascii="Arial" w:hAnsi="Arial" w:cs="Arial" w:eastAsia="Arial"/>
+          <w:b w:val="0"/>
+          <w:color w:val="C0392B"/>
+          <w:sz w:val="20"/>
+        </w:rPr>
+        <w:t xml:space="preserve">▪  </w:t>
+      </w:r>
+      <w:r>
+        <w:rPr>
+          <w:rFonts w:ascii="Arial" w:hAnsi="Arial" w:cs="Arial" w:eastAsia="Arial"/>
+          <w:b/>
+          <w:color w:val="1A2D4F"/>
+          <w:sz w:val="20"/>
+        </w:rPr>
+        <w:t>Pharmacy benefit manager (PBM):</w:t>
+      </w:r>
+      <w:r>
+        <w:rPr>
+          <w:rFonts w:ascii="Arial" w:hAnsi="Arial" w:cs="Arial" w:eastAsia="Arial"/>
+          <w:b w:val="0"/>
+          <w:color w:val="444444"/>
+          <w:sz w:val="20"/>
+        </w:rPr>
+        <w:t xml:space="preserve"> A middleman hired by insurers to run drug benefits — choosing covered drugs, negotiating drugmaker rebates, and setting pharmacy payments — a major driver of what patients pay at the counter.</w:t>
+      </w:r>
+    </w:p>
+    <w:p>
+      <w:pPr>
+        <w:widowControl/>
+        <w:spacing w:before="0" w:after="60" w:lineRule="auto" w:line="252"/>
+        <w:ind w:left="200"/>
+      </w:pPr>
+      <w:r>
+        <w:rPr>
+          <w:rFonts w:ascii="Arial" w:hAnsi="Arial" w:cs="Arial" w:eastAsia="Arial"/>
+          <w:b w:val="0"/>
+          <w:color w:val="C0392B"/>
+          <w:sz w:val="20"/>
+        </w:rPr>
+        <w:t xml:space="preserve">▪  </w:t>
+      </w:r>
+      <w:r>
+        <w:rPr>
+          <w:rFonts w:ascii="Arial" w:hAnsi="Arial" w:cs="Arial" w:eastAsia="Arial"/>
+          <w:b/>
+          <w:color w:val="1A2D4F"/>
+          <w:sz w:val="20"/>
+        </w:rPr>
+        <w:t>Prior authorization:</w:t>
+      </w:r>
+      <w:r>
+        <w:rPr>
+          <w:rFonts w:ascii="Arial" w:hAnsi="Arial" w:cs="Arial" w:eastAsia="Arial"/>
+          <w:b w:val="0"/>
+          <w:color w:val="444444"/>
+          <w:sz w:val="20"/>
+        </w:rPr>
+        <w:t xml:space="preserve"> Requiring a doctor to get insurer approval before a treatment or prescription is covered.</w:t>
+      </w:r>
+    </w:p>
+    <w:p>
+      <w:pPr>
+        <w:widowControl/>
+        <w:spacing w:before="0" w:after="60" w:lineRule="auto" w:line="252"/>
+        <w:ind w:left="200"/>
+      </w:pPr>
+      <w:r>
+        <w:rPr>
+          <w:rFonts w:ascii="Arial" w:hAnsi="Arial" w:cs="Arial" w:eastAsia="Arial"/>
+          <w:b w:val="0"/>
+          <w:color w:val="C0392B"/>
+          <w:sz w:val="20"/>
+        </w:rPr>
+        <w:t xml:space="preserve">▪  </w:t>
+      </w:r>
+      <w:r>
+        <w:rPr>
+          <w:rFonts w:ascii="Arial" w:hAnsi="Arial" w:cs="Arial" w:eastAsia="Arial"/>
+          <w:b/>
+          <w:color w:val="1A2D4F"/>
+          <w:sz w:val="20"/>
+        </w:rPr>
+        <w:t>Provider-assessment mechanism:</w:t>
+      </w:r>
+      <w:r>
+        <w:rPr>
+          <w:rFonts w:ascii="Arial" w:hAnsi="Arial" w:cs="Arial" w:eastAsia="Arial"/>
+          <w:b w:val="0"/>
+          <w:color w:val="444444"/>
+          <w:sz w:val="20"/>
+        </w:rPr>
+        <w:t xml:space="preserve"> A fee on providers used to draw federal matching money — funding higher Medicaid payments without state general-fund dollars.</w:t>
+      </w:r>
+    </w:p>
+    <w:p>
+      <w:pPr>
+        <w:widowControl/>
+        <w:spacing w:before="0" w:after="60" w:lineRule="auto" w:line="252"/>
+        <w:ind w:left="200"/>
+      </w:pPr>
+      <w:r>
+        <w:rPr>
+          <w:rFonts w:ascii="Arial" w:hAnsi="Arial" w:cs="Arial" w:eastAsia="Arial"/>
+          <w:b w:val="0"/>
+          <w:color w:val="C0392B"/>
+          <w:sz w:val="20"/>
+        </w:rPr>
+        <w:t xml:space="preserve">▪  </w:t>
+      </w:r>
+      <w:r>
+        <w:rPr>
+          <w:rFonts w:ascii="Arial" w:hAnsi="Arial" w:cs="Arial" w:eastAsia="Arial"/>
+          <w:b/>
+          <w:color w:val="1A2D4F"/>
+          <w:sz w:val="20"/>
+        </w:rPr>
+        <w:t>Public Option:</w:t>
+      </w:r>
+      <w:r>
+        <w:rPr>
+          <w:rFonts w:ascii="Arial" w:hAnsi="Arial" w:cs="Arial" w:eastAsia="Arial"/>
+          <w:b w:val="0"/>
+          <w:color w:val="444444"/>
+          <w:sz w:val="20"/>
+        </w:rPr>
+        <w:t xml:space="preserve"> A state-designed health plan any Nevadan can buy.</w:t>
+      </w:r>
+    </w:p>
+    <w:p>
+      <w:pPr>
+        <w:widowControl/>
+        <w:spacing w:before="0" w:after="60" w:lineRule="auto" w:line="252"/>
+        <w:ind w:left="200"/>
+      </w:pPr>
+      <w:r>
+        <w:rPr>
+          <w:rFonts w:ascii="Arial" w:hAnsi="Arial" w:cs="Arial" w:eastAsia="Arial"/>
+          <w:b w:val="0"/>
+          <w:color w:val="C0392B"/>
+          <w:sz w:val="20"/>
+        </w:rPr>
+        <w:t xml:space="preserve">▪  </w:t>
+      </w:r>
+      <w:r>
+        <w:rPr>
+          <w:rFonts w:ascii="Arial" w:hAnsi="Arial" w:cs="Arial" w:eastAsia="Arial"/>
+          <w:b/>
+          <w:color w:val="1A2D4F"/>
+          <w:sz w:val="20"/>
+        </w:rPr>
+        <w:t>Rebate pass-through:</w:t>
+      </w:r>
+      <w:r>
+        <w:rPr>
+          <w:rFonts w:ascii="Arial" w:hAnsi="Arial" w:cs="Arial" w:eastAsia="Arial"/>
+          <w:b w:val="0"/>
+          <w:color w:val="444444"/>
+          <w:sz w:val="20"/>
+        </w:rPr>
+        <w:t xml:space="preserve"> Passing the discounts drugmakers pay PBMs along to the payer, as Nevada requires for Medicaid.</w:t>
+      </w:r>
+    </w:p>
+    <w:p>
+      <w:pPr>
+        <w:widowControl/>
+        <w:spacing w:before="0" w:after="60" w:lineRule="auto" w:line="252"/>
+        <w:ind w:left="200"/>
+      </w:pPr>
+      <w:r>
+        <w:rPr>
+          <w:rFonts w:ascii="Arial" w:hAnsi="Arial" w:cs="Arial" w:eastAsia="Arial"/>
+          <w:b w:val="0"/>
+          <w:color w:val="C0392B"/>
+          <w:sz w:val="20"/>
+        </w:rPr>
+        <w:t xml:space="preserve">▪  </w:t>
+      </w:r>
+      <w:r>
+        <w:rPr>
+          <w:rFonts w:ascii="Arial" w:hAnsi="Arial" w:cs="Arial" w:eastAsia="Arial"/>
+          <w:b/>
+          <w:color w:val="1A2D4F"/>
+          <w:sz w:val="20"/>
+        </w:rPr>
+        <w:t>Recruitment grant program:</w:t>
+      </w:r>
+      <w:r>
+        <w:rPr>
+          <w:rFonts w:ascii="Arial" w:hAnsi="Arial" w:cs="Arial" w:eastAsia="Arial"/>
+          <w:b w:val="0"/>
+          <w:color w:val="444444"/>
+          <w:sz w:val="20"/>
+        </w:rPr>
+        <w:t xml:space="preserve"> State grants aimed at provider shortages, enacted in the 2025 special session.</w:t>
+      </w:r>
+    </w:p>
+    <w:p>
+      <w:pPr>
+        <w:widowControl/>
+        <w:spacing w:before="0" w:after="60" w:lineRule="auto" w:line="252"/>
+        <w:ind w:left="200"/>
+      </w:pPr>
+      <w:r>
+        <w:rPr>
+          <w:rFonts w:ascii="Arial" w:hAnsi="Arial" w:cs="Arial" w:eastAsia="Arial"/>
+          <w:b w:val="0"/>
+          <w:color w:val="C0392B"/>
+          <w:sz w:val="20"/>
+        </w:rPr>
+        <w:t xml:space="preserve">▪  </w:t>
+      </w:r>
+      <w:r>
+        <w:rPr>
+          <w:rFonts w:ascii="Arial" w:hAnsi="Arial" w:cs="Arial" w:eastAsia="Arial"/>
+          <w:b/>
+          <w:color w:val="1A2D4F"/>
+          <w:sz w:val="20"/>
+        </w:rPr>
+        <w:t>Reimbursement rate:</w:t>
+      </w:r>
+      <w:r>
+        <w:rPr>
+          <w:rFonts w:ascii="Arial" w:hAnsi="Arial" w:cs="Arial" w:eastAsia="Arial"/>
+          <w:b w:val="0"/>
+          <w:color w:val="444444"/>
+          <w:sz w:val="20"/>
+        </w:rPr>
+        <w:t xml:space="preserve"> What an insurer or program pays a provider; low rates are why some providers do not accept Medicaid patients.</w:t>
+      </w:r>
+    </w:p>
+    <w:p>
+      <w:pPr>
+        <w:widowControl/>
+        <w:spacing w:before="0" w:after="60" w:lineRule="auto" w:line="252"/>
+        <w:ind w:left="200"/>
+      </w:pPr>
+      <w:r>
+        <w:rPr>
+          <w:rFonts w:ascii="Arial" w:hAnsi="Arial" w:cs="Arial" w:eastAsia="Arial"/>
+          <w:b w:val="0"/>
+          <w:color w:val="C0392B"/>
+          <w:sz w:val="20"/>
+        </w:rPr>
+        <w:t xml:space="preserve">▪  </w:t>
+      </w:r>
+      <w:r>
+        <w:rPr>
+          <w:rFonts w:ascii="Arial" w:hAnsi="Arial" w:cs="Arial" w:eastAsia="Arial"/>
+          <w:b/>
+          <w:color w:val="1A2D4F"/>
+          <w:sz w:val="20"/>
+        </w:rPr>
+        <w:t>Residency:</w:t>
+      </w:r>
+      <w:r>
+        <w:rPr>
+          <w:rFonts w:ascii="Arial" w:hAnsi="Arial" w:cs="Arial" w:eastAsia="Arial"/>
+          <w:b w:val="0"/>
+          <w:color w:val="444444"/>
+          <w:sz w:val="20"/>
+        </w:rPr>
+        <w:t xml:space="preserve"> Supervised hospital training after medical school — the bottleneck for growing the doctor supply and the target of Nevada's residency grants.</w:t>
+      </w:r>
+    </w:p>
+    <w:p>
+      <w:pPr>
+        <w:widowControl/>
+        <w:spacing w:before="0" w:after="60" w:lineRule="auto" w:line="252"/>
+        <w:ind w:left="200"/>
+      </w:pPr>
+      <w:r>
+        <w:rPr>
+          <w:rFonts w:ascii="Arial" w:hAnsi="Arial" w:cs="Arial" w:eastAsia="Arial"/>
+          <w:b w:val="0"/>
+          <w:color w:val="C0392B"/>
+          <w:sz w:val="20"/>
+        </w:rPr>
+        <w:t xml:space="preserve">▪  </w:t>
+      </w:r>
+      <w:r>
+        <w:rPr>
+          <w:rFonts w:ascii="Arial" w:hAnsi="Arial" w:cs="Arial" w:eastAsia="Arial"/>
+          <w:b/>
+          <w:color w:val="1A2D4F"/>
+          <w:sz w:val="20"/>
+        </w:rPr>
+        <w:t>Self-funded employer plan:</w:t>
+      </w:r>
+      <w:r>
+        <w:rPr>
+          <w:rFonts w:ascii="Arial" w:hAnsi="Arial" w:cs="Arial" w:eastAsia="Arial"/>
+          <w:b w:val="0"/>
+          <w:color w:val="444444"/>
+          <w:sz w:val="20"/>
+        </w:rPr>
+        <w:t xml:space="preserve"> A plan where the employer pays claims itself; most large-employer coverage works this way, beyond state regulation (see ERISA).</w:t>
+      </w:r>
+    </w:p>
+    <w:p>
+      <w:pPr>
+        <w:widowControl/>
+        <w:spacing w:before="0" w:after="60" w:lineRule="auto" w:line="252"/>
+        <w:ind w:left="200"/>
+      </w:pPr>
+      <w:r>
+        <w:rPr>
+          <w:rFonts w:ascii="Arial" w:hAnsi="Arial" w:cs="Arial" w:eastAsia="Arial"/>
+          <w:b w:val="0"/>
+          <w:color w:val="C0392B"/>
+          <w:sz w:val="20"/>
+        </w:rPr>
+        <w:t xml:space="preserve">▪  </w:t>
+      </w:r>
+      <w:r>
+        <w:rPr>
+          <w:rFonts w:ascii="Arial" w:hAnsi="Arial" w:cs="Arial" w:eastAsia="Arial"/>
+          <w:b/>
+          <w:color w:val="1A2D4F"/>
+          <w:sz w:val="20"/>
+        </w:rPr>
+        <w:t>Step therapy:</w:t>
+      </w:r>
+      <w:r>
+        <w:rPr>
+          <w:rFonts w:ascii="Arial" w:hAnsi="Arial" w:cs="Arial" w:eastAsia="Arial"/>
+          <w:b w:val="0"/>
+          <w:color w:val="444444"/>
+          <w:sz w:val="20"/>
+        </w:rPr>
+        <w:t xml:space="preserve"> Requiring a patient to try cheaper drugs first — and "fail" on them — before the prescribed one is covered.</w:t>
+      </w:r>
+    </w:p>
+    <w:p>
+      <w:pPr>
+        <w:widowControl/>
+        <w:spacing w:before="0" w:after="60" w:lineRule="auto" w:line="252"/>
+        <w:ind w:left="200"/>
+      </w:pPr>
+      <w:r>
+        <w:rPr>
+          <w:rFonts w:ascii="Arial" w:hAnsi="Arial" w:cs="Arial" w:eastAsia="Arial"/>
+          <w:b w:val="0"/>
+          <w:color w:val="C0392B"/>
+          <w:sz w:val="20"/>
+        </w:rPr>
+        <w:t xml:space="preserve">▪  </w:t>
+      </w:r>
+      <w:r>
+        <w:rPr>
+          <w:rFonts w:ascii="Arial" w:hAnsi="Arial" w:cs="Arial" w:eastAsia="Arial"/>
+          <w:b/>
+          <w:color w:val="1A2D4F"/>
+          <w:sz w:val="20"/>
+        </w:rPr>
+        <w:t>Telehealth:</w:t>
+      </w:r>
+      <w:r>
+        <w:rPr>
+          <w:rFonts w:ascii="Arial" w:hAnsi="Arial" w:cs="Arial" w:eastAsia="Arial"/>
+          <w:b w:val="0"/>
+          <w:color w:val="444444"/>
+          <w:sz w:val="20"/>
+        </w:rPr>
+        <w:t xml:space="preserve"> Care delivered by video or phone; settled Nevada law.</w:t>
+      </w:r>
+    </w:p>
+    <w:p>
+      <w:pPr>
+        <w:widowControl/>
+        <w:spacing w:before="0" w:after="60" w:lineRule="auto" w:line="252"/>
+        <w:ind w:left="200"/>
+      </w:pPr>
+      <w:r>
+        <w:rPr>
+          <w:rFonts w:ascii="Arial" w:hAnsi="Arial" w:cs="Arial" w:eastAsia="Arial"/>
+          <w:b w:val="0"/>
+          <w:color w:val="C0392B"/>
+          <w:sz w:val="20"/>
+        </w:rPr>
+        <w:t xml:space="preserve">▪  </w:t>
+      </w:r>
+      <w:r>
+        <w:rPr>
+          <w:rFonts w:ascii="Arial" w:hAnsi="Arial" w:cs="Arial" w:eastAsia="Arial"/>
+          <w:b/>
+          <w:color w:val="1A2D4F"/>
+          <w:sz w:val="20"/>
+        </w:rPr>
+        <w:t>Tricare:</w:t>
+      </w:r>
+      <w:r>
+        <w:rPr>
+          <w:rFonts w:ascii="Arial" w:hAnsi="Arial" w:cs="Arial" w:eastAsia="Arial"/>
+          <w:b w:val="0"/>
+          <w:color w:val="444444"/>
+          <w:sz w:val="20"/>
+        </w:rPr>
+        <w:t xml:space="preserve"> The federal health program for military members, retirees, and their families.</w:t>
       </w:r>
     </w:p>
     <w:p>
@@ -70,205 +1286,23 @@
           <w:sz w:val="25"/>
           <w:spacing w:val="20"/>
         </w:rPr>
-        <w:t>HEALTH CARE AND INSURANCE TERMS</w:t>
+        <w:t>LEGISLATIVE PROCESS GUIDE</w:t>
       </w:r>
     </w:p>
     <w:p>
       <w:pPr>
         <w:widowControl/>
-        <w:spacing w:before="0" w:after="40" w:lineRule="auto" w:line="247"/>
+        <w:spacing w:before="0" w:after="60" w:lineRule="auto" w:line="252"/>
+        <w:ind w:left="200"/>
       </w:pPr>
       <w:r>
         <w:rPr>
           <w:rFonts w:ascii="Arial" w:hAnsi="Arial" w:cs="Arial" w:eastAsia="Arial"/>
           <w:b w:val="0"/>
-          <w:i/>
-          <w:color w:val="666666"/>
+          <w:color w:val="C0392B"/>
           <w:sz w:val="20"/>
         </w:rPr>
-        <w:t>Subject terms used in the brief's proposal sections.</w:t>
-      </w:r>
-    </w:p>
-    <w:p>
-      <w:pPr>
-        <w:keepLines/>
-        <w:widowControl/>
-        <w:spacing w:before="0" w:after="56" w:lineRule="auto" w:line="247"/>
-        <w:jc w:val="both"/>
-      </w:pPr>
-      <w:r>
-        <w:rPr>
-          <w:rFonts w:ascii="Arial" w:hAnsi="Arial" w:cs="Arial" w:eastAsia="Arial"/>
-          <w:b/>
-          <w:color w:val="1A2D4F"/>
-          <w:sz w:val="20"/>
-        </w:rPr>
-        <w:t>Pharmacy benefit manager (PBM).</w:t>
-      </w:r>
-      <w:r>
-        <w:rPr>
-          <w:rFonts w:ascii="Arial" w:hAnsi="Arial" w:cs="Arial" w:eastAsia="Arial"/>
-          <w:b w:val="0"/>
-          <w:color w:val="444444"/>
-          <w:sz w:val="20"/>
-        </w:rPr>
-        <w:t xml:space="preserve"> A middleman hired by insurers to run drug benefits — deciding which drugs are covered, negotiating rebates from drugmakers, and setting what pharmacies get paid. A major driver of what patients pay at the counter.</w:t>
-      </w:r>
-    </w:p>
-    <w:p>
-      <w:pPr>
-        <w:keepLines/>
-        <w:widowControl/>
-        <w:spacing w:before="0" w:after="56" w:lineRule="auto" w:line="247"/>
-        <w:jc w:val="both"/>
-      </w:pPr>
-      <w:r>
-        <w:rPr>
-          <w:rFonts w:ascii="Arial" w:hAnsi="Arial" w:cs="Arial" w:eastAsia="Arial"/>
-          <w:b/>
-          <w:color w:val="1A2D4F"/>
-          <w:sz w:val="20"/>
-        </w:rPr>
-        <w:t>Gag clause.</w:t>
-      </w:r>
-      <w:r>
-        <w:rPr>
-          <w:rFonts w:ascii="Arial" w:hAnsi="Arial" w:cs="Arial" w:eastAsia="Arial"/>
-          <w:b w:val="0"/>
-          <w:color w:val="444444"/>
-          <w:sz w:val="20"/>
-        </w:rPr>
-        <w:t xml:space="preserve"> A contract term that barred pharmacists from volunteering that paying cash would be cheaper than using insurance; now banned in Nevada.</w:t>
-      </w:r>
-    </w:p>
-    <w:p>
-      <w:pPr>
-        <w:keepLines/>
-        <w:widowControl/>
-        <w:spacing w:before="0" w:after="56" w:lineRule="auto" w:line="247"/>
-        <w:jc w:val="both"/>
-      </w:pPr>
-      <w:r>
-        <w:rPr>
-          <w:rFonts w:ascii="Arial" w:hAnsi="Arial" w:cs="Arial" w:eastAsia="Arial"/>
-          <w:b/>
-          <w:color w:val="1A2D4F"/>
-          <w:sz w:val="20"/>
-        </w:rPr>
-        <w:t>Rebate pass-through.</w:t>
-      </w:r>
-      <w:r>
-        <w:rPr>
-          <w:rFonts w:ascii="Arial" w:hAnsi="Arial" w:cs="Arial" w:eastAsia="Arial"/>
-          <w:b w:val="0"/>
-          <w:color w:val="444444"/>
-          <w:sz w:val="20"/>
-        </w:rPr>
-        <w:t xml:space="preserve"> Requiring the discounts drugmakers pay to PBMs to be passed along to the payer, as Nevada requires for Medicaid.</w:t>
-      </w:r>
-    </w:p>
-    <w:p>
-      <w:pPr>
-        <w:keepLines/>
-        <w:widowControl/>
-        <w:spacing w:before="0" w:after="56" w:lineRule="auto" w:line="247"/>
-        <w:jc w:val="both"/>
-      </w:pPr>
-      <w:r>
-        <w:rPr>
-          <w:rFonts w:ascii="Arial" w:hAnsi="Arial" w:cs="Arial" w:eastAsia="Arial"/>
-          <w:b/>
-          <w:color w:val="1A2D4F"/>
-          <w:sz w:val="20"/>
-        </w:rPr>
-        <w:t>340B.</w:t>
-      </w:r>
-      <w:r>
-        <w:rPr>
-          <w:rFonts w:ascii="Arial" w:hAnsi="Arial" w:cs="Arial" w:eastAsia="Arial"/>
-          <w:b w:val="0"/>
-          <w:color w:val="444444"/>
-          <w:sz w:val="20"/>
-        </w:rPr>
-        <w:t xml:space="preserve"> A federal program letting hospitals and clinics that serve low-income patients buy drugs at deep discounts.</w:t>
-      </w:r>
-    </w:p>
-    <w:p>
-      <w:pPr>
-        <w:keepLines/>
-        <w:widowControl/>
-        <w:spacing w:before="0" w:after="56" w:lineRule="auto" w:line="247"/>
-        <w:jc w:val="both"/>
-      </w:pPr>
-      <w:r>
-        <w:rPr>
-          <w:rFonts w:ascii="Arial" w:hAnsi="Arial" w:cs="Arial" w:eastAsia="Arial"/>
-          <w:b/>
-          <w:color w:val="1A2D4F"/>
-          <w:sz w:val="20"/>
-        </w:rPr>
-        <w:t>Prior authorization.</w:t>
-      </w:r>
-      <w:r>
-        <w:rPr>
-          <w:rFonts w:ascii="Arial" w:hAnsi="Arial" w:cs="Arial" w:eastAsia="Arial"/>
-          <w:b w:val="0"/>
-          <w:color w:val="444444"/>
-          <w:sz w:val="20"/>
-        </w:rPr>
-        <w:t xml:space="preserve"> An insurer's requirement that a doctor get approval before a treatment or prescription is covered.</w:t>
-      </w:r>
-    </w:p>
-    <w:p>
-      <w:pPr>
-        <w:keepLines/>
-        <w:widowControl/>
-        <w:spacing w:before="0" w:after="56" w:lineRule="auto" w:line="247"/>
-        <w:jc w:val="both"/>
-      </w:pPr>
-      <w:r>
-        <w:rPr>
-          <w:rFonts w:ascii="Arial" w:hAnsi="Arial" w:cs="Arial" w:eastAsia="Arial"/>
-          <w:b/>
-          <w:color w:val="1A2D4F"/>
-          <w:sz w:val="20"/>
-        </w:rPr>
-        <w:t>Step therapy.</w:t>
-      </w:r>
-      <w:r>
-        <w:rPr>
-          <w:rFonts w:ascii="Arial" w:hAnsi="Arial" w:cs="Arial" w:eastAsia="Arial"/>
-          <w:b w:val="0"/>
-          <w:color w:val="444444"/>
-          <w:sz w:val="20"/>
-        </w:rPr>
-        <w:t xml:space="preserve"> An insurer's requirement that a patient try cheaper drugs first — and "fail" on them — before the prescribed one is covered.</w:t>
-      </w:r>
-    </w:p>
-    <w:p>
-      <w:pPr>
-        <w:keepLines/>
-        <w:widowControl/>
-        <w:spacing w:before="0" w:after="56" w:lineRule="auto" w:line="247"/>
-        <w:jc w:val="both"/>
-      </w:pPr>
-      <w:r>
-        <w:rPr>
-          <w:rFonts w:ascii="Arial" w:hAnsi="Arial" w:cs="Arial" w:eastAsia="Arial"/>
-          <w:b/>
-          <w:color w:val="1A2D4F"/>
-          <w:sz w:val="20"/>
-        </w:rPr>
-        <w:t>Licensure compact.</w:t>
-      </w:r>
-      <w:r>
-        <w:rPr>
-          <w:rFonts w:ascii="Arial" w:hAnsi="Arial" w:cs="Arial" w:eastAsia="Arial"/>
-          <w:b w:val="0"/>
-          <w:color w:val="444444"/>
-          <w:sz w:val="20"/>
-        </w:rPr>
-        <w:t xml:space="preserve"> An agreement among states to honor each other's professional licenses, so a provider licensed in one member state can practice in the others. The </w:t>
+        <w:t xml:space="preserve">▪  </w:t>
       </w:r>
       <w:r>
         <w:rPr>
@@ -277,791 +1311,7 @@
           <w:color w:val="1A2D4F"/>
           <w:sz w:val="20"/>
         </w:rPr>
-        <w:t>Nurse Licensure Compact</w:t>
-      </w:r>
-      <w:r>
-        <w:rPr>
-          <w:rFonts w:ascii="Arial" w:hAnsi="Arial" w:cs="Arial" w:eastAsia="Arial"/>
-          <w:b w:val="0"/>
-          <w:color w:val="444444"/>
-          <w:sz w:val="20"/>
-        </w:rPr>
-        <w:t xml:space="preserve"> is the nursing version — the one compact Nevada has not joined.</w:t>
-      </w:r>
-    </w:p>
-    <w:p>
-      <w:pPr>
-        <w:keepLines/>
-        <w:widowControl/>
-        <w:spacing w:before="0" w:after="56" w:lineRule="auto" w:line="247"/>
-        <w:jc w:val="both"/>
-      </w:pPr>
-      <w:r>
-        <w:rPr>
-          <w:rFonts w:ascii="Arial" w:hAnsi="Arial" w:cs="Arial" w:eastAsia="Arial"/>
-          <w:b/>
-          <w:color w:val="1A2D4F"/>
-          <w:sz w:val="20"/>
-        </w:rPr>
-        <w:t>Credentialing.</w:t>
-      </w:r>
-      <w:r>
-        <w:rPr>
-          <w:rFonts w:ascii="Arial" w:hAnsi="Arial" w:cs="Arial" w:eastAsia="Arial"/>
-          <w:b w:val="0"/>
-          <w:color w:val="444444"/>
-          <w:sz w:val="20"/>
-        </w:rPr>
-        <w:t xml:space="preserve"> An insurer's process for vetting and approving a provider to join its network. Slow credentialing keeps new providers from seeing insured patients for months.</w:t>
-      </w:r>
-    </w:p>
-    <w:p>
-      <w:pPr>
-        <w:keepLines/>
-        <w:widowControl/>
-        <w:spacing w:before="0" w:after="56" w:lineRule="auto" w:line="247"/>
-        <w:jc w:val="both"/>
-      </w:pPr>
-      <w:r>
-        <w:rPr>
-          <w:rFonts w:ascii="Arial" w:hAnsi="Arial" w:cs="Arial" w:eastAsia="Arial"/>
-          <w:b/>
-          <w:color w:val="1A2D4F"/>
-          <w:sz w:val="20"/>
-        </w:rPr>
-        <w:t>Network / panel.</w:t>
-      </w:r>
-      <w:r>
-        <w:rPr>
-          <w:rFonts w:ascii="Arial" w:hAnsi="Arial" w:cs="Arial" w:eastAsia="Arial"/>
-          <w:b w:val="0"/>
-          <w:color w:val="444444"/>
-          <w:sz w:val="20"/>
-        </w:rPr>
-        <w:t xml:space="preserve"> The providers under contract with an insurer. A provider whose "panel is full" is not accepting new patients; no Nevada law defines when a panel counts as full.</w:t>
-      </w:r>
-    </w:p>
-    <w:p>
-      <w:pPr>
-        <w:keepLines/>
-        <w:widowControl/>
-        <w:spacing w:before="0" w:after="56" w:lineRule="auto" w:line="247"/>
-        <w:jc w:val="both"/>
-      </w:pPr>
-      <w:r>
-        <w:rPr>
-          <w:rFonts w:ascii="Arial" w:hAnsi="Arial" w:cs="Arial" w:eastAsia="Arial"/>
-          <w:b/>
-          <w:color w:val="1A2D4F"/>
-          <w:sz w:val="20"/>
-        </w:rPr>
-        <w:t>Out-of-network.</w:t>
-      </w:r>
-      <w:r>
-        <w:rPr>
-          <w:rFonts w:ascii="Arial" w:hAnsi="Arial" w:cs="Arial" w:eastAsia="Arial"/>
-          <w:b w:val="0"/>
-          <w:color w:val="444444"/>
-          <w:sz w:val="20"/>
-        </w:rPr>
-        <w:t xml:space="preserve"> A provider with no contract with the patient's insurer — the source of the highest surprise bills.</w:t>
-      </w:r>
-    </w:p>
-    <w:p>
-      <w:pPr>
-        <w:keepLines/>
-        <w:widowControl/>
-        <w:spacing w:before="0" w:after="56" w:lineRule="auto" w:line="247"/>
-        <w:jc w:val="both"/>
-      </w:pPr>
-      <w:r>
-        <w:rPr>
-          <w:rFonts w:ascii="Arial" w:hAnsi="Arial" w:cs="Arial" w:eastAsia="Arial"/>
-          <w:b/>
-          <w:color w:val="1A2D4F"/>
-          <w:sz w:val="20"/>
-        </w:rPr>
-        <w:t>Arbitration.</w:t>
-      </w:r>
-      <w:r>
-        <w:rPr>
-          <w:rFonts w:ascii="Arial" w:hAnsi="Arial" w:cs="Arial" w:eastAsia="Arial"/>
-          <w:b w:val="0"/>
-          <w:color w:val="444444"/>
-          <w:sz w:val="20"/>
-        </w:rPr>
-        <w:t xml:space="preserve"> A neutral process that settles insurer–provider payment disputes outside court. </w:t>
-      </w:r>
-      <w:r>
-        <w:rPr>
-          <w:rFonts w:ascii="Arial" w:hAnsi="Arial" w:cs="Arial" w:eastAsia="Arial"/>
-          <w:b/>
-          <w:color w:val="1A2D4F"/>
-          <w:sz w:val="20"/>
-        </w:rPr>
-        <w:t>Forced arbitration</w:t>
-      </w:r>
-      <w:r>
-        <w:rPr>
-          <w:rFonts w:ascii="Arial" w:hAnsi="Arial" w:cs="Arial" w:eastAsia="Arial"/>
-          <w:b w:val="0"/>
-          <w:color w:val="444444"/>
-          <w:sz w:val="20"/>
-        </w:rPr>
-        <w:t xml:space="preserve"> — the vetoed-bill subject — is a policy clause that strips the patient's right to sue.</w:t>
-      </w:r>
-    </w:p>
-    <w:p>
-      <w:pPr>
-        <w:keepLines/>
-        <w:widowControl/>
-        <w:spacing w:before="0" w:after="56" w:lineRule="auto" w:line="247"/>
-        <w:jc w:val="both"/>
-      </w:pPr>
-      <w:r>
-        <w:rPr>
-          <w:rFonts w:ascii="Arial" w:hAnsi="Arial" w:cs="Arial" w:eastAsia="Arial"/>
-          <w:b/>
-          <w:color w:val="1A2D4F"/>
-          <w:sz w:val="20"/>
-        </w:rPr>
-        <w:t>ER / urgent care.</w:t>
-      </w:r>
-      <w:r>
-        <w:rPr>
-          <w:rFonts w:ascii="Arial" w:hAnsi="Arial" w:cs="Arial" w:eastAsia="Arial"/>
-          <w:b w:val="0"/>
-          <w:color w:val="444444"/>
-          <w:sz w:val="20"/>
-        </w:rPr>
-        <w:t xml:space="preserve"> Emergency room versus walk-in clinic. ER visits carry hospital-level charges even for minor problems — why participants proposed splitting the billing.</w:t>
-      </w:r>
-    </w:p>
-    <w:p>
-      <w:pPr>
-        <w:keepLines/>
-        <w:widowControl/>
-        <w:spacing w:before="0" w:after="56" w:lineRule="auto" w:line="247"/>
-        <w:jc w:val="both"/>
-      </w:pPr>
-      <w:r>
-        <w:rPr>
-          <w:rFonts w:ascii="Arial" w:hAnsi="Arial" w:cs="Arial" w:eastAsia="Arial"/>
-          <w:b/>
-          <w:color w:val="1A2D4F"/>
-          <w:sz w:val="20"/>
-        </w:rPr>
-        <w:t>Telehealth.</w:t>
-      </w:r>
-      <w:r>
-        <w:rPr>
-          <w:rFonts w:ascii="Arial" w:hAnsi="Arial" w:cs="Arial" w:eastAsia="Arial"/>
-          <w:b w:val="0"/>
-          <w:color w:val="444444"/>
-          <w:sz w:val="20"/>
-        </w:rPr>
-        <w:t xml:space="preserve"> Medical care delivered by video or phone; settled Nevada law.</w:t>
-      </w:r>
-    </w:p>
-    <w:p>
-      <w:pPr>
-        <w:keepLines/>
-        <w:widowControl/>
-        <w:spacing w:before="0" w:after="56" w:lineRule="auto" w:line="247"/>
-        <w:jc w:val="both"/>
-      </w:pPr>
-      <w:r>
-        <w:rPr>
-          <w:rFonts w:ascii="Arial" w:hAnsi="Arial" w:cs="Arial" w:eastAsia="Arial"/>
-          <w:b/>
-          <w:color w:val="1A2D4F"/>
-          <w:sz w:val="20"/>
-        </w:rPr>
-        <w:t>Reimbursement rate.</w:t>
-      </w:r>
-      <w:r>
-        <w:rPr>
-          <w:rFonts w:ascii="Arial" w:hAnsi="Arial" w:cs="Arial" w:eastAsia="Arial"/>
-          <w:b w:val="0"/>
-          <w:color w:val="444444"/>
-          <w:sz w:val="20"/>
-        </w:rPr>
-        <w:t xml:space="preserve"> What an insurer or government program pays a provider. Low rates are why some providers do not accept Medicaid patients.</w:t>
-      </w:r>
-    </w:p>
-    <w:p>
-      <w:pPr>
-        <w:keepLines/>
-        <w:widowControl/>
-        <w:spacing w:before="0" w:after="56" w:lineRule="auto" w:line="247"/>
-        <w:jc w:val="both"/>
-      </w:pPr>
-      <w:r>
-        <w:rPr>
-          <w:rFonts w:ascii="Arial" w:hAnsi="Arial" w:cs="Arial" w:eastAsia="Arial"/>
-          <w:b/>
-          <w:color w:val="1A2D4F"/>
-          <w:sz w:val="20"/>
-        </w:rPr>
-        <w:t>Provider-assessment mechanism.</w:t>
-      </w:r>
-      <w:r>
-        <w:rPr>
-          <w:rFonts w:ascii="Arial" w:hAnsi="Arial" w:cs="Arial" w:eastAsia="Arial"/>
-          <w:b w:val="0"/>
-          <w:color w:val="444444"/>
-          <w:sz w:val="20"/>
-        </w:rPr>
-        <w:t xml:space="preserve"> A fee collected from providers and used to draw down federal matching money — funding higher Medicaid payments without state general-fund dollars.</w:t>
-      </w:r>
-    </w:p>
-    <w:p>
-      <w:pPr>
-        <w:keepLines/>
-        <w:widowControl/>
-        <w:spacing w:before="0" w:after="56" w:lineRule="auto" w:line="247"/>
-        <w:jc w:val="both"/>
-      </w:pPr>
-      <w:r>
-        <w:rPr>
-          <w:rFonts w:ascii="Arial" w:hAnsi="Arial" w:cs="Arial" w:eastAsia="Arial"/>
-          <w:b/>
-          <w:color w:val="1A2D4F"/>
-          <w:sz w:val="20"/>
-        </w:rPr>
-        <w:t>Medicaid / CHIP.</w:t>
-      </w:r>
-      <w:r>
-        <w:rPr>
-          <w:rFonts w:ascii="Arial" w:hAnsi="Arial" w:cs="Arial" w:eastAsia="Arial"/>
-          <w:b w:val="0"/>
-          <w:color w:val="444444"/>
-          <w:sz w:val="20"/>
-        </w:rPr>
-        <w:t xml:space="preserve"> The state-federal insurance program for lower-income Nevadans, and its companion program for children. The state sets many of its rules, which is why so many bills target it.</w:t>
-      </w:r>
-    </w:p>
-    <w:p>
-      <w:pPr>
-        <w:keepLines/>
-        <w:widowControl/>
-        <w:spacing w:before="0" w:after="56" w:lineRule="auto" w:line="247"/>
-        <w:jc w:val="both"/>
-      </w:pPr>
-      <w:r>
-        <w:rPr>
-          <w:rFonts w:ascii="Arial" w:hAnsi="Arial" w:cs="Arial" w:eastAsia="Arial"/>
-          <w:b/>
-          <w:color w:val="1A2D4F"/>
-          <w:sz w:val="20"/>
-        </w:rPr>
-        <w:t>Medicare.</w:t>
-      </w:r>
-      <w:r>
-        <w:rPr>
-          <w:rFonts w:ascii="Arial" w:hAnsi="Arial" w:cs="Arial" w:eastAsia="Arial"/>
-          <w:b w:val="0"/>
-          <w:color w:val="444444"/>
-          <w:sz w:val="20"/>
-        </w:rPr>
-        <w:t xml:space="preserve"> The federal insurance program for people 65 and over and some people with disabilities. Its payment rates and drug prices are set federally.</w:t>
-      </w:r>
-    </w:p>
-    <w:p>
-      <w:pPr>
-        <w:keepLines/>
-        <w:widowControl/>
-        <w:spacing w:before="0" w:after="56" w:lineRule="auto" w:line="247"/>
-        <w:jc w:val="both"/>
-      </w:pPr>
-      <w:r>
-        <w:rPr>
-          <w:rFonts w:ascii="Arial" w:hAnsi="Arial" w:cs="Arial" w:eastAsia="Arial"/>
-          <w:b/>
-          <w:color w:val="1A2D4F"/>
-          <w:sz w:val="20"/>
-        </w:rPr>
-        <w:t>Tricare.</w:t>
-      </w:r>
-      <w:r>
-        <w:rPr>
-          <w:rFonts w:ascii="Arial" w:hAnsi="Arial" w:cs="Arial" w:eastAsia="Arial"/>
-          <w:b w:val="0"/>
-          <w:color w:val="444444"/>
-          <w:sz w:val="20"/>
-        </w:rPr>
-        <w:t xml:space="preserve"> The federal health program for military members, retirees, and their families.</w:t>
-      </w:r>
-    </w:p>
-    <w:p>
-      <w:pPr>
-        <w:keepLines/>
-        <w:widowControl/>
-        <w:spacing w:before="0" w:after="56" w:lineRule="auto" w:line="247"/>
-        <w:jc w:val="both"/>
-      </w:pPr>
-      <w:r>
-        <w:rPr>
-          <w:rFonts w:ascii="Arial" w:hAnsi="Arial" w:cs="Arial" w:eastAsia="Arial"/>
-          <w:b/>
-          <w:color w:val="1A2D4F"/>
-          <w:sz w:val="20"/>
-        </w:rPr>
-        <w:t>Public Option.</w:t>
-      </w:r>
-      <w:r>
-        <w:rPr>
-          <w:rFonts w:ascii="Arial" w:hAnsi="Arial" w:cs="Arial" w:eastAsia="Arial"/>
-          <w:b w:val="0"/>
-          <w:color w:val="444444"/>
-          <w:sz w:val="20"/>
-        </w:rPr>
-        <w:t xml:space="preserve"> A state-designed health plan any Nevadan can buy.</w:t>
-      </w:r>
-    </w:p>
-    <w:p>
-      <w:pPr>
-        <w:keepLines/>
-        <w:widowControl/>
-        <w:spacing w:before="0" w:after="56" w:lineRule="auto" w:line="247"/>
-        <w:jc w:val="both"/>
-      </w:pPr>
-      <w:r>
-        <w:rPr>
-          <w:rFonts w:ascii="Arial" w:hAnsi="Arial" w:cs="Arial" w:eastAsia="Arial"/>
-          <w:b/>
-          <w:color w:val="1A2D4F"/>
-          <w:sz w:val="20"/>
-        </w:rPr>
-        <w:t>Any-group pooling.</w:t>
-      </w:r>
-      <w:r>
-        <w:rPr>
-          <w:rFonts w:ascii="Arial" w:hAnsi="Arial" w:cs="Arial" w:eastAsia="Arial"/>
-          <w:b w:val="0"/>
-          <w:color w:val="444444"/>
-          <w:sz w:val="20"/>
-        </w:rPr>
-        <w:t xml:space="preserve"> Letting small businesses or unrelated groups band together to buy insurance at large-group prices — never filed as a bill.</w:t>
-      </w:r>
-    </w:p>
-    <w:p>
-      <w:pPr>
-        <w:keepLines/>
-        <w:widowControl/>
-        <w:spacing w:before="0" w:after="56" w:lineRule="auto" w:line="247"/>
-        <w:jc w:val="both"/>
-      </w:pPr>
-      <w:r>
-        <w:rPr>
-          <w:rFonts w:ascii="Arial" w:hAnsi="Arial" w:cs="Arial" w:eastAsia="Arial"/>
-          <w:b/>
-          <w:color w:val="1A2D4F"/>
-          <w:sz w:val="20"/>
-        </w:rPr>
-        <w:t>Self-funded employer plan.</w:t>
-      </w:r>
-      <w:r>
-        <w:rPr>
-          <w:rFonts w:ascii="Arial" w:hAnsi="Arial" w:cs="Arial" w:eastAsia="Arial"/>
-          <w:b w:val="0"/>
-          <w:color w:val="444444"/>
-          <w:sz w:val="20"/>
-        </w:rPr>
-        <w:t xml:space="preserve"> A plan where the employer pays claims itself and an insurer only administers paperwork. Most large-employer coverage works this way — and it is beyond state regulation (see ERISA).</w:t>
-      </w:r>
-    </w:p>
-    <w:p>
-      <w:pPr>
-        <w:keepLines/>
-        <w:widowControl/>
-        <w:spacing w:before="0" w:after="56" w:lineRule="auto" w:line="247"/>
-        <w:jc w:val="both"/>
-      </w:pPr>
-      <w:r>
-        <w:rPr>
-          <w:rFonts w:ascii="Arial" w:hAnsi="Arial" w:cs="Arial" w:eastAsia="Arial"/>
-          <w:b/>
-          <w:color w:val="1A2D4F"/>
-          <w:sz w:val="20"/>
-        </w:rPr>
-        <w:t>Health Service Corps.</w:t>
-      </w:r>
-      <w:r>
-        <w:rPr>
-          <w:rFonts w:ascii="Arial" w:hAnsi="Arial" w:cs="Arial" w:eastAsia="Arial"/>
-          <w:b w:val="0"/>
-          <w:color w:val="444444"/>
-          <w:sz w:val="20"/>
-        </w:rPr>
-        <w:t xml:space="preserve"> Nevada's loan-repayment program for providers who commit to practicing in underserved areas.</w:t>
-      </w:r>
-    </w:p>
-    <w:p>
-      <w:pPr>
-        <w:keepLines/>
-        <w:widowControl/>
-        <w:spacing w:before="0" w:after="56" w:lineRule="auto" w:line="247"/>
-        <w:jc w:val="both"/>
-      </w:pPr>
-      <w:r>
-        <w:rPr>
-          <w:rFonts w:ascii="Arial" w:hAnsi="Arial" w:cs="Arial" w:eastAsia="Arial"/>
-          <w:b/>
-          <w:color w:val="1A2D4F"/>
-          <w:sz w:val="20"/>
-        </w:rPr>
-        <w:t>Residency.</w:t>
-      </w:r>
-      <w:r>
-        <w:rPr>
-          <w:rFonts w:ascii="Arial" w:hAnsi="Arial" w:cs="Arial" w:eastAsia="Arial"/>
-          <w:b w:val="0"/>
-          <w:color w:val="444444"/>
-          <w:sz w:val="20"/>
-        </w:rPr>
-        <w:t xml:space="preserve"> The years of supervised hospital training after medical school — the bottleneck for growing the doctor supply, and the target of Nevada's residency grants.</w:t>
-      </w:r>
-    </w:p>
-    <w:p>
-      <w:pPr>
-        <w:keepLines/>
-        <w:widowControl/>
-        <w:spacing w:before="0" w:after="56" w:lineRule="auto" w:line="247"/>
-        <w:jc w:val="both"/>
-      </w:pPr>
-      <w:r>
-        <w:rPr>
-          <w:rFonts w:ascii="Arial" w:hAnsi="Arial" w:cs="Arial" w:eastAsia="Arial"/>
-          <w:b/>
-          <w:color w:val="1A2D4F"/>
-          <w:sz w:val="20"/>
-        </w:rPr>
-        <w:t>Foreign medical graduates.</w:t>
-      </w:r>
-      <w:r>
-        <w:rPr>
-          <w:rFonts w:ascii="Arial" w:hAnsi="Arial" w:cs="Arial" w:eastAsia="Arial"/>
-          <w:b w:val="0"/>
-          <w:color w:val="444444"/>
-          <w:sz w:val="20"/>
-        </w:rPr>
-        <w:t xml:space="preserve"> Doctors trained abroad, whose path to full Nevada licensure was eased in 2025.</w:t>
-      </w:r>
-    </w:p>
-    <w:p>
-      <w:pPr>
-        <w:keepLines/>
-        <w:widowControl/>
-        <w:spacing w:before="0" w:after="56" w:lineRule="auto" w:line="247"/>
-        <w:jc w:val="both"/>
-      </w:pPr>
-      <w:r>
-        <w:rPr>
-          <w:rFonts w:ascii="Arial" w:hAnsi="Arial" w:cs="Arial" w:eastAsia="Arial"/>
-          <w:b/>
-          <w:color w:val="1A2D4F"/>
-          <w:sz w:val="20"/>
-        </w:rPr>
-        <w:t>Autism behavior technicians.</w:t>
-      </w:r>
-      <w:r>
-        <w:rPr>
-          <w:rFonts w:ascii="Arial" w:hAnsi="Arial" w:cs="Arial" w:eastAsia="Arial"/>
-          <w:b w:val="0"/>
-          <w:color w:val="444444"/>
-          <w:sz w:val="20"/>
-        </w:rPr>
-        <w:t xml:space="preserve"> Front-line providers of behavioral therapy for autistic children.</w:t>
-      </w:r>
-    </w:p>
-    <w:p>
-      <w:pPr>
-        <w:keepLines/>
-        <w:widowControl/>
-        <w:spacing w:before="0" w:after="56" w:lineRule="auto" w:line="247"/>
-        <w:jc w:val="both"/>
-      </w:pPr>
-      <w:r>
-        <w:rPr>
-          <w:rFonts w:ascii="Arial" w:hAnsi="Arial" w:cs="Arial" w:eastAsia="Arial"/>
-          <w:b/>
-          <w:color w:val="1A2D4F"/>
-          <w:sz w:val="20"/>
-        </w:rPr>
-        <w:t>Dental therapy.</w:t>
-      </w:r>
-      <w:r>
-        <w:rPr>
-          <w:rFonts w:ascii="Arial" w:hAnsi="Arial" w:cs="Arial" w:eastAsia="Arial"/>
-          <w:b w:val="0"/>
-          <w:color w:val="444444"/>
-          <w:sz w:val="20"/>
-        </w:rPr>
-        <w:t xml:space="preserve"> A licensed midlevel dental profession — more training than a hygienist, less than a dentist.</w:t>
-      </w:r>
-    </w:p>
-    <w:p>
-      <w:pPr>
-        <w:keepLines/>
-        <w:widowControl/>
-        <w:spacing w:before="0" w:after="56" w:lineRule="auto" w:line="247"/>
-        <w:jc w:val="both"/>
-      </w:pPr>
-      <w:r>
-        <w:rPr>
-          <w:rFonts w:ascii="Arial" w:hAnsi="Arial" w:cs="Arial" w:eastAsia="Arial"/>
-          <w:b/>
-          <w:color w:val="1A2D4F"/>
-          <w:sz w:val="20"/>
-        </w:rPr>
-        <w:t>Medical-debt collection.</w:t>
-      </w:r>
-      <w:r>
-        <w:rPr>
-          <w:rFonts w:ascii="Arial" w:hAnsi="Arial" w:cs="Arial" w:eastAsia="Arial"/>
-          <w:b w:val="0"/>
-          <w:color w:val="444444"/>
-          <w:sz w:val="20"/>
-        </w:rPr>
-        <w:t xml:space="preserve"> The lawsuits, garnishments, and credit tactics used to collect unpaid medical bills; bills limiting them were vetoed.</w:t>
-      </w:r>
-    </w:p>
-    <w:p>
-      <w:pPr>
-        <w:keepLines/>
-        <w:widowControl/>
-        <w:spacing w:before="0" w:after="56" w:lineRule="auto" w:line="247"/>
-        <w:jc w:val="both"/>
-      </w:pPr>
-      <w:r>
-        <w:rPr>
-          <w:rFonts w:ascii="Arial" w:hAnsi="Arial" w:cs="Arial" w:eastAsia="Arial"/>
-          <w:b/>
-          <w:color w:val="1A2D4F"/>
-          <w:sz w:val="20"/>
-        </w:rPr>
-        <w:t>Nevada Health Authority.</w:t>
-      </w:r>
-      <w:r>
-        <w:rPr>
-          <w:rFonts w:ascii="Arial" w:hAnsi="Arial" w:cs="Arial" w:eastAsia="Arial"/>
-          <w:b w:val="0"/>
-          <w:color w:val="444444"/>
-          <w:sz w:val="20"/>
-        </w:rPr>
-        <w:t xml:space="preserve"> The new state agency that consolidates Nevada's public health-insurance programs.</w:t>
-      </w:r>
-    </w:p>
-    <w:p>
-      <w:pPr>
-        <w:keepLines/>
-        <w:widowControl/>
-        <w:spacing w:before="0" w:after="56" w:lineRule="auto" w:line="247"/>
-        <w:jc w:val="both"/>
-      </w:pPr>
-      <w:r>
-        <w:rPr>
-          <w:rFonts w:ascii="Arial" w:hAnsi="Arial" w:cs="Arial" w:eastAsia="Arial"/>
-          <w:b/>
-          <w:color w:val="1A2D4F"/>
-          <w:sz w:val="20"/>
-        </w:rPr>
-        <w:t>Recruitment grant program.</w:t>
-      </w:r>
-      <w:r>
-        <w:rPr>
-          <w:rFonts w:ascii="Arial" w:hAnsi="Arial" w:cs="Arial" w:eastAsia="Arial"/>
-          <w:b w:val="0"/>
-          <w:color w:val="444444"/>
-          <w:sz w:val="20"/>
-        </w:rPr>
-        <w:t xml:space="preserve"> Competitive state grants aimed at critical provider shortages, enacted in the 2025 special session.</w:t>
-      </w:r>
-    </w:p>
-    <w:p>
-      <w:pPr>
-        <w:widowControl/>
-        <w:spacing w:before="100" w:after="40" w:lineRule="auto" w:line="254"/>
-      </w:pPr>
-      <w:r>
-        <w:rPr>
-          <w:rFonts w:ascii="Arial" w:hAnsi="Arial" w:cs="Arial" w:eastAsia="Arial"/>
-          <w:b/>
-          <w:color w:val="C0392B"/>
-          <w:sz w:val="25"/>
-          <w:spacing w:val="20"/>
-        </w:rPr>
-        <w:t>FEDERAL PROGRAMS AND TERMS</w:t>
-      </w:r>
-    </w:p>
-    <w:p>
-      <w:pPr>
-        <w:widowControl/>
-        <w:spacing w:before="0" w:after="40" w:lineRule="auto" w:line="247"/>
-      </w:pPr>
-      <w:r>
-        <w:rPr>
-          <w:rFonts w:ascii="Arial" w:hAnsi="Arial" w:cs="Arial" w:eastAsia="Arial"/>
-          <w:b w:val="0"/>
-          <w:i/>
-          <w:color w:val="666666"/>
-          <w:sz w:val="20"/>
-        </w:rPr>
-        <w:t>Terms from the brief's federal-overlap section.</w:t>
-      </w:r>
-    </w:p>
-    <w:p>
-      <w:pPr>
-        <w:keepLines/>
-        <w:widowControl/>
-        <w:spacing w:before="0" w:after="56" w:lineRule="auto" w:line="247"/>
-        <w:jc w:val="both"/>
-      </w:pPr>
-      <w:r>
-        <w:rPr>
-          <w:rFonts w:ascii="Arial" w:hAnsi="Arial" w:cs="Arial" w:eastAsia="Arial"/>
-          <w:b/>
-          <w:color w:val="1A2D4F"/>
-          <w:sz w:val="20"/>
-        </w:rPr>
-        <w:t>No Surprises Act.</w:t>
-      </w:r>
-      <w:r>
-        <w:rPr>
-          <w:rFonts w:ascii="Arial" w:hAnsi="Arial" w:cs="Arial" w:eastAsia="Arial"/>
-          <w:b w:val="0"/>
-          <w:color w:val="444444"/>
-          <w:sz w:val="20"/>
-        </w:rPr>
-        <w:t xml:space="preserve"> The federal law, in force since 2022, protecting patients nationwide from surprise out-of-network emergency bills.</w:t>
-      </w:r>
-    </w:p>
-    <w:p>
-      <w:pPr>
-        <w:keepLines/>
-        <w:widowControl/>
-        <w:spacing w:before="0" w:after="56" w:lineRule="auto" w:line="247"/>
-        <w:jc w:val="both"/>
-      </w:pPr>
-      <w:r>
-        <w:rPr>
-          <w:rFonts w:ascii="Arial" w:hAnsi="Arial" w:cs="Arial" w:eastAsia="Arial"/>
-          <w:b/>
-          <w:color w:val="1A2D4F"/>
-          <w:sz w:val="20"/>
-        </w:rPr>
-        <w:t>Medicare-negotiated prices.</w:t>
-      </w:r>
-      <w:r>
-        <w:rPr>
-          <w:rFonts w:ascii="Arial" w:hAnsi="Arial" w:cs="Arial" w:eastAsia="Arial"/>
-          <w:b w:val="0"/>
-          <w:color w:val="444444"/>
-          <w:sz w:val="20"/>
-        </w:rPr>
-        <w:t xml:space="preserve"> Drug prices the federal government negotiates directly with manufacturers under a 2022 law; the first take effect in 2026. Nevada's vetoed price caps were pegged to them.</w:t>
-      </w:r>
-    </w:p>
-    <w:p>
-      <w:pPr>
-        <w:keepLines/>
-        <w:widowControl/>
-        <w:spacing w:before="0" w:after="56" w:lineRule="auto" w:line="247"/>
-        <w:jc w:val="both"/>
-      </w:pPr>
-      <w:r>
-        <w:rPr>
-          <w:rFonts w:ascii="Arial" w:hAnsi="Arial" w:cs="Arial" w:eastAsia="Arial"/>
-          <w:b/>
-          <w:color w:val="1A2D4F"/>
-          <w:sz w:val="20"/>
-        </w:rPr>
-        <w:t>Federal prior-authorization rules.</w:t>
-      </w:r>
-      <w:r>
-        <w:rPr>
-          <w:rFonts w:ascii="Arial" w:hAnsi="Arial" w:cs="Arial" w:eastAsia="Arial"/>
-          <w:b w:val="0"/>
-          <w:color w:val="444444"/>
-          <w:sz w:val="20"/>
-        </w:rPr>
-        <w:t xml:space="preserve"> Rules finalized in 2024 imposing decision deadlines on Medicare Advantage, Medicaid, and exchange plans through 2027; Nevada's law covers the state-regulated plans they do not reach.</w:t>
-      </w:r>
-    </w:p>
-    <w:p>
-      <w:pPr>
-        <w:keepLines/>
-        <w:widowControl/>
-        <w:spacing w:before="0" w:after="56" w:lineRule="auto" w:line="247"/>
-        <w:jc w:val="both"/>
-      </w:pPr>
-      <w:r>
-        <w:rPr>
-          <w:rFonts w:ascii="Arial" w:hAnsi="Arial" w:cs="Arial" w:eastAsia="Arial"/>
-          <w:b/>
-          <w:color w:val="1A2D4F"/>
-          <w:sz w:val="20"/>
-        </w:rPr>
-        <w:t>ERISA.</w:t>
-      </w:r>
-      <w:r>
-        <w:rPr>
-          <w:rFonts w:ascii="Arial" w:hAnsi="Arial" w:cs="Arial" w:eastAsia="Arial"/>
-          <w:b w:val="0"/>
-          <w:color w:val="444444"/>
-          <w:sz w:val="20"/>
-        </w:rPr>
-        <w:t xml:space="preserve"> The federal Employee Retirement Income Security Act, which puts self-funded employer health plans under federal — not state — regulation.</w:t>
-      </w:r>
-    </w:p>
-    <w:p>
-      <w:pPr>
-        <w:widowControl/>
-        <w:spacing w:before="100" w:after="40" w:lineRule="auto" w:line="254"/>
-      </w:pPr>
-      <w:r>
-        <w:rPr>
-          <w:rFonts w:ascii="Arial" w:hAnsi="Arial" w:cs="Arial" w:eastAsia="Arial"/>
-          <w:b/>
-          <w:color w:val="C0392B"/>
-          <w:sz w:val="25"/>
-          <w:spacing w:val="20"/>
-        </w:rPr>
-        <w:t>ACRONYMS AND ABBREVIATIONS</w:t>
-      </w:r>
-    </w:p>
-    <w:p>
-      <w:pPr>
-        <w:widowControl/>
-        <w:spacing w:before="0" w:after="40" w:lineRule="auto" w:line="247"/>
-      </w:pPr>
-      <w:r>
-        <w:rPr>
-          <w:rFonts w:ascii="Arial" w:hAnsi="Arial" w:cs="Arial" w:eastAsia="Arial"/>
-          <w:b w:val="0"/>
-          <w:i/>
-          <w:color w:val="666666"/>
-          <w:sz w:val="20"/>
-        </w:rPr>
-        <w:t>Every shortened form used in the brief.</w:t>
-      </w:r>
-    </w:p>
-    <w:p>
-      <w:pPr>
-        <w:keepLines/>
-        <w:widowControl/>
-        <w:spacing w:before="0" w:after="56" w:lineRule="auto" w:line="247"/>
-        <w:jc w:val="both"/>
-      </w:pPr>
-      <w:r>
-        <w:rPr>
-          <w:rFonts w:ascii="Arial" w:hAnsi="Arial" w:cs="Arial" w:eastAsia="Arial"/>
-          <w:b/>
-          <w:color w:val="1A2D4F"/>
-          <w:sz w:val="20"/>
-        </w:rPr>
-        <w:t>AB / SB.</w:t>
+        <w:t>AB / SB:</w:t>
       </w:r>
       <w:r>
         <w:rPr>
@@ -1075,11 +1325,19 @@
     </w:p>
     <w:p>
       <w:pPr>
-        <w:keepLines/>
         <w:widowControl/>
-        <w:spacing w:before="0" w:after="56" w:lineRule="auto" w:line="247"/>
-        <w:jc w:val="both"/>
+        <w:spacing w:before="0" w:after="60" w:lineRule="auto" w:line="252"/>
+        <w:ind w:left="200"/>
       </w:pPr>
+      <w:r>
+        <w:rPr>
+          <w:rFonts w:ascii="Arial" w:hAnsi="Arial" w:cs="Arial" w:eastAsia="Arial"/>
+          <w:b w:val="0"/>
+          <w:color w:val="C0392B"/>
+          <w:sz w:val="20"/>
+        </w:rPr>
+        <w:t xml:space="preserve">▪  </w:t>
+      </w:r>
       <w:r>
         <w:rPr>
           <w:rFonts w:ascii="Arial" w:hAnsi="Arial" w:cs="Arial" w:eastAsia="Arial"/>
@@ -1087,7 +1345,7 @@
           <w:color w:val="1A2D4F"/>
           <w:sz w:val="20"/>
         </w:rPr>
-        <w:t>D / R.</w:t>
+        <w:t>Amendment / concurrence:</w:t>
       </w:r>
       <w:r>
         <w:rPr>
@@ -1096,16 +1354,24 @@
           <w:color w:val="444444"/>
           <w:sz w:val="20"/>
         </w:rPr>
-        <w:t xml:space="preserve"> Democrat / Republican, shown after a legislator's name.</w:t>
+        <w:t xml:space="preserve"> A change made to a bill along the way; if one chamber amends, the other must vote to accept — "concur in" — the change. Bills can die awaiting that one last vote.</w:t>
       </w:r>
     </w:p>
     <w:p>
       <w:pPr>
-        <w:keepLines/>
         <w:widowControl/>
-        <w:spacing w:before="0" w:after="56" w:lineRule="auto" w:line="247"/>
-        <w:jc w:val="both"/>
+        <w:spacing w:before="0" w:after="60" w:lineRule="auto" w:line="252"/>
+        <w:ind w:left="200"/>
       </w:pPr>
+      <w:r>
+        <w:rPr>
+          <w:rFonts w:ascii="Arial" w:hAnsi="Arial" w:cs="Arial" w:eastAsia="Arial"/>
+          <w:b w:val="0"/>
+          <w:color w:val="C0392B"/>
+          <w:sz w:val="20"/>
+        </w:rPr>
+        <w:t xml:space="preserve">▪  </w:t>
+      </w:r>
       <w:r>
         <w:rPr>
           <w:rFonts w:ascii="Arial" w:hAnsi="Arial" w:cs="Arial" w:eastAsia="Arial"/>
@@ -1113,7 +1379,7 @@
           <w:color w:val="1A2D4F"/>
           <w:sz w:val="20"/>
         </w:rPr>
-        <w:t>PBM.</w:t>
+        <w:t>Appropriation:</w:t>
       </w:r>
       <w:r>
         <w:rPr>
@@ -1122,16 +1388,24 @@
           <w:color w:val="444444"/>
           <w:sz w:val="20"/>
         </w:rPr>
-        <w:t xml:space="preserve"> Pharmacy benefit manager.</w:t>
+        <w:t xml:space="preserve"> A bill or provision that sets aside state money for a purpose.</w:t>
       </w:r>
     </w:p>
     <w:p>
       <w:pPr>
-        <w:keepLines/>
         <w:widowControl/>
-        <w:spacing w:before="0" w:after="56" w:lineRule="auto" w:line="247"/>
-        <w:jc w:val="both"/>
+        <w:spacing w:before="0" w:after="60" w:lineRule="auto" w:line="252"/>
+        <w:ind w:left="200"/>
       </w:pPr>
+      <w:r>
+        <w:rPr>
+          <w:rFonts w:ascii="Arial" w:hAnsi="Arial" w:cs="Arial" w:eastAsia="Arial"/>
+          <w:b w:val="0"/>
+          <w:color w:val="C0392B"/>
+          <w:sz w:val="20"/>
+        </w:rPr>
+        <w:t xml:space="preserve">▪  </w:t>
+      </w:r>
       <w:r>
         <w:rPr>
           <w:rFonts w:ascii="Arial" w:hAnsi="Arial" w:cs="Arial" w:eastAsia="Arial"/>
@@ -1139,7 +1413,7 @@
           <w:color w:val="1A2D4F"/>
           <w:sz w:val="20"/>
         </w:rPr>
-        <w:t>ER.</w:t>
+        <w:t>Chambers:</w:t>
       </w:r>
       <w:r>
         <w:rPr>
@@ -1148,16 +1422,24 @@
           <w:color w:val="444444"/>
           <w:sz w:val="20"/>
         </w:rPr>
-        <w:t xml:space="preserve"> Emergency room.</w:t>
+        <w:t xml:space="preserve"> The Legislature's two houses: the Assembly (42 members) and the Senate (21). A bill must pass both to reach the governor.</w:t>
       </w:r>
     </w:p>
     <w:p>
       <w:pPr>
-        <w:keepLines/>
         <w:widowControl/>
-        <w:spacing w:before="0" w:after="56" w:lineRule="auto" w:line="247"/>
-        <w:jc w:val="both"/>
+        <w:spacing w:before="0" w:after="60" w:lineRule="auto" w:line="252"/>
+        <w:ind w:left="200"/>
       </w:pPr>
+      <w:r>
+        <w:rPr>
+          <w:rFonts w:ascii="Arial" w:hAnsi="Arial" w:cs="Arial" w:eastAsia="Arial"/>
+          <w:b w:val="0"/>
+          <w:color w:val="C0392B"/>
+          <w:sz w:val="20"/>
+        </w:rPr>
+        <w:t xml:space="preserve">▪  </w:t>
+      </w:r>
       <w:r>
         <w:rPr>
           <w:rFonts w:ascii="Arial" w:hAnsi="Arial" w:cs="Arial" w:eastAsia="Arial"/>
@@ -1165,7 +1447,7 @@
           <w:color w:val="1A2D4F"/>
           <w:sz w:val="20"/>
         </w:rPr>
-        <w:t>EMS.</w:t>
+        <w:t>Committee / first committee:</w:t>
       </w:r>
       <w:r>
         <w:rPr>
@@ -1174,16 +1456,24 @@
           <w:color w:val="444444"/>
           <w:sz w:val="20"/>
         </w:rPr>
-        <w:t xml:space="preserve"> Emergency medical services — ambulance and paramedic personnel.</w:t>
+        <w:t xml:space="preserve"> A small panel of lawmakers that studies a bill and votes on whether to send it onward; most bills that fail die in their first committee — "never heard" means no hearing at all.</w:t>
       </w:r>
     </w:p>
     <w:p>
       <w:pPr>
-        <w:keepLines/>
         <w:widowControl/>
-        <w:spacing w:before="0" w:after="56" w:lineRule="auto" w:line="247"/>
-        <w:jc w:val="both"/>
+        <w:spacing w:before="0" w:after="60" w:lineRule="auto" w:line="252"/>
+        <w:ind w:left="200"/>
       </w:pPr>
+      <w:r>
+        <w:rPr>
+          <w:rFonts w:ascii="Arial" w:hAnsi="Arial" w:cs="Arial" w:eastAsia="Arial"/>
+          <w:b w:val="0"/>
+          <w:color w:val="C0392B"/>
+          <w:sz w:val="20"/>
+        </w:rPr>
+        <w:t xml:space="preserve">▪  </w:t>
+      </w:r>
       <w:r>
         <w:rPr>
           <w:rFonts w:ascii="Arial" w:hAnsi="Arial" w:cs="Arial" w:eastAsia="Arial"/>
@@ -1191,7 +1481,7 @@
           <w:color w:val="1A2D4F"/>
           <w:sz w:val="20"/>
         </w:rPr>
-        <w:t>CHIP.</w:t>
+        <w:t>D / R:</w:t>
       </w:r>
       <w:r>
         <w:rPr>
@@ -1200,16 +1490,24 @@
           <w:color w:val="444444"/>
           <w:sz w:val="20"/>
         </w:rPr>
-        <w:t xml:space="preserve"> Children's Health Insurance Program.</w:t>
+        <w:t xml:space="preserve"> Democrat / Republican, shown after a legislator's name; "still serves" and "has left" reflect the current roster.</w:t>
       </w:r>
     </w:p>
     <w:p>
       <w:pPr>
-        <w:keepLines/>
         <w:widowControl/>
-        <w:spacing w:before="0" w:after="56" w:lineRule="auto" w:line="247"/>
-        <w:jc w:val="both"/>
+        <w:spacing w:before="0" w:after="60" w:lineRule="auto" w:line="252"/>
+        <w:ind w:left="200"/>
       </w:pPr>
+      <w:r>
+        <w:rPr>
+          <w:rFonts w:ascii="Arial" w:hAnsi="Arial" w:cs="Arial" w:eastAsia="Arial"/>
+          <w:b w:val="0"/>
+          <w:color w:val="C0392B"/>
+          <w:sz w:val="20"/>
+        </w:rPr>
+        <w:t xml:space="preserve">▪  </w:t>
+      </w:r>
       <w:r>
         <w:rPr>
           <w:rFonts w:ascii="Arial" w:hAnsi="Arial" w:cs="Arial" w:eastAsia="Arial"/>
@@ -1217,7 +1515,7 @@
           <w:color w:val="1A2D4F"/>
           <w:sz w:val="20"/>
         </w:rPr>
-        <w:t>HHS.</w:t>
+        <w:t>Delivered / signed / chapter:</w:t>
       </w:r>
       <w:r>
         <w:rPr>
@@ -1226,16 +1524,24 @@
           <w:color w:val="444444"/>
           <w:sz w:val="20"/>
         </w:rPr>
-        <w:t xml:space="preserve"> Health and Human Services, as in the Senate and Assembly HHS committees.</w:t>
+        <w:t xml:space="preserve"> A passed bill is delivered to the governor; a signed bill becomes a numbered "chapter" of state law, and "no signature, no chapter" means it never became law.</w:t>
       </w:r>
     </w:p>
     <w:p>
       <w:pPr>
-        <w:keepLines/>
         <w:widowControl/>
-        <w:spacing w:before="0" w:after="56" w:lineRule="auto" w:line="247"/>
-        <w:jc w:val="both"/>
+        <w:spacing w:before="0" w:after="60" w:lineRule="auto" w:line="252"/>
+        <w:ind w:left="200"/>
       </w:pPr>
+      <w:r>
+        <w:rPr>
+          <w:rFonts w:ascii="Arial" w:hAnsi="Arial" w:cs="Arial" w:eastAsia="Arial"/>
+          <w:b w:val="0"/>
+          <w:color w:val="C0392B"/>
+          <w:sz w:val="20"/>
+        </w:rPr>
+        <w:t xml:space="preserve">▪  </w:t>
+      </w:r>
       <w:r>
         <w:rPr>
           <w:rFonts w:ascii="Arial" w:hAnsi="Arial" w:cs="Arial" w:eastAsia="Arial"/>
@@ -1243,7 +1549,7 @@
           <w:color w:val="1A2D4F"/>
           <w:sz w:val="20"/>
         </w:rPr>
-        <w:t>ERISA.</w:t>
+        <w:t>Died at session's end / out of time:</w:t>
       </w:r>
       <w:r>
         <w:rPr>
@@ -1252,8 +1558,393 @@
           <w:color w:val="444444"/>
           <w:sz w:val="20"/>
         </w:rPr>
-        <w:t xml:space="preserve"> Employee Retirement Income Security Act (federal).</w:t>
+        <w:t xml:space="preserve"> A bill that cleared every vote taken but ran out of calendar before the final step — in these briefs, a mark of proven support, not rejection.</w:t>
       </w:r>
+    </w:p>
+    <w:p>
+      <w:pPr>
+        <w:widowControl/>
+        <w:spacing w:before="0" w:after="60" w:lineRule="auto" w:line="252"/>
+        <w:ind w:left="200"/>
+      </w:pPr>
+      <w:r>
+        <w:rPr>
+          <w:rFonts w:ascii="Arial" w:hAnsi="Arial" w:cs="Arial" w:eastAsia="Arial"/>
+          <w:b w:val="0"/>
+          <w:color w:val="C0392B"/>
+          <w:sz w:val="20"/>
+        </w:rPr>
+        <w:t xml:space="preserve">▪  </w:t>
+      </w:r>
+      <w:r>
+        <w:rPr>
+          <w:rFonts w:ascii="Arial" w:hAnsi="Arial" w:cs="Arial" w:eastAsia="Arial"/>
+          <w:b/>
+          <w:color w:val="1A2D4F"/>
+          <w:sz w:val="20"/>
+        </w:rPr>
+        <w:t>Floor vote / floor calendar:</w:t>
+      </w:r>
+      <w:r>
+        <w:rPr>
+          <w:rFonts w:ascii="Arial" w:hAnsi="Arial" w:cs="Arial" w:eastAsia="Arial"/>
+          <w:b w:val="0"/>
+          <w:color w:val="444444"/>
+          <w:sz w:val="20"/>
+        </w:rPr>
+        <w:t xml:space="preserve"> A vote of the full chamber, and the schedule of bills waiting for one; a bill "dies on the calendar" when the session ends before its turn — a scheduling death, not a defeat.</w:t>
+      </w:r>
+    </w:p>
+    <w:p>
+      <w:pPr>
+        <w:widowControl/>
+        <w:spacing w:before="0" w:after="60" w:lineRule="auto" w:line="252"/>
+        <w:ind w:left="200"/>
+      </w:pPr>
+      <w:r>
+        <w:rPr>
+          <w:rFonts w:ascii="Arial" w:hAnsi="Arial" w:cs="Arial" w:eastAsia="Arial"/>
+          <w:b w:val="0"/>
+          <w:color w:val="C0392B"/>
+          <w:sz w:val="20"/>
+        </w:rPr>
+        <w:t xml:space="preserve">▪  </w:t>
+      </w:r>
+      <w:r>
+        <w:rPr>
+          <w:rFonts w:ascii="Arial" w:hAnsi="Arial" w:cs="Arial" w:eastAsia="Arial"/>
+          <w:b/>
+          <w:color w:val="1A2D4F"/>
+          <w:sz w:val="20"/>
+        </w:rPr>
+        <w:t>Interim committee / interim study:</w:t>
+      </w:r>
+      <w:r>
+        <w:rPr>
+          <w:rFonts w:ascii="Arial" w:hAnsi="Arial" w:cs="Arial" w:eastAsia="Arial"/>
+          <w:b w:val="0"/>
+          <w:color w:val="444444"/>
+          <w:sz w:val="20"/>
+        </w:rPr>
+        <w:t xml:space="preserve"> Panels that meet between sessions to study a topic and prepare recommendations for the next session.</w:t>
+      </w:r>
+    </w:p>
+    <w:p>
+      <w:pPr>
+        <w:widowControl/>
+        <w:spacing w:before="0" w:after="60" w:lineRule="auto" w:line="252"/>
+        <w:ind w:left="200"/>
+      </w:pPr>
+      <w:r>
+        <w:rPr>
+          <w:rFonts w:ascii="Arial" w:hAnsi="Arial" w:cs="Arial" w:eastAsia="Arial"/>
+          <w:b w:val="0"/>
+          <w:color w:val="C0392B"/>
+          <w:sz w:val="20"/>
+        </w:rPr>
+        <w:t xml:space="preserve">▪  </w:t>
+      </w:r>
+      <w:r>
+        <w:rPr>
+          <w:rFonts w:ascii="Arial" w:hAnsi="Arial" w:cs="Arial" w:eastAsia="Arial"/>
+          <w:b/>
+          <w:color w:val="1A2D4F"/>
+          <w:sz w:val="20"/>
+        </w:rPr>
+        <w:t>Money committees / the money stage:</w:t>
+      </w:r>
+      <w:r>
+        <w:rPr>
+          <w:rFonts w:ascii="Arial" w:hAnsi="Arial" w:cs="Arial" w:eastAsia="Arial"/>
+          <w:b w:val="0"/>
+          <w:color w:val="444444"/>
+          <w:sz w:val="20"/>
+        </w:rPr>
+        <w:t xml:space="preserve"> Assembly Ways and Means and Senate Finance review anything that costs money; bills with price tags routinely stop there without a vote against the policy itself.</w:t>
+      </w:r>
+    </w:p>
+    <w:p>
+      <w:pPr>
+        <w:widowControl/>
+        <w:spacing w:before="0" w:after="60" w:lineRule="auto" w:line="252"/>
+        <w:ind w:left="200"/>
+      </w:pPr>
+      <w:r>
+        <w:rPr>
+          <w:rFonts w:ascii="Arial" w:hAnsi="Arial" w:cs="Arial" w:eastAsia="Arial"/>
+          <w:b w:val="0"/>
+          <w:color w:val="C0392B"/>
+          <w:sz w:val="20"/>
+        </w:rPr>
+        <w:t xml:space="preserve">▪  </w:t>
+      </w:r>
+      <w:r>
+        <w:rPr>
+          <w:rFonts w:ascii="Arial" w:hAnsi="Arial" w:cs="Arial" w:eastAsia="Arial"/>
+          <w:b/>
+          <w:color w:val="1A2D4F"/>
+          <w:sz w:val="20"/>
+        </w:rPr>
+        <w:t>Second house:</w:t>
+      </w:r>
+      <w:r>
+        <w:rPr>
+          <w:rFonts w:ascii="Arial" w:hAnsi="Arial" w:cs="Arial" w:eastAsia="Arial"/>
+          <w:b w:val="0"/>
+          <w:color w:val="444444"/>
+          <w:sz w:val="20"/>
+        </w:rPr>
+        <w:t xml:space="preserve"> After passing the chamber where it started, a bill repeats the entire process — committee, then floor — in the other chamber.</w:t>
+      </w:r>
+    </w:p>
+    <w:p>
+      <w:pPr>
+        <w:widowControl/>
+        <w:spacing w:before="0" w:after="60" w:lineRule="auto" w:line="252"/>
+        <w:ind w:left="200"/>
+      </w:pPr>
+      <w:r>
+        <w:rPr>
+          <w:rFonts w:ascii="Arial" w:hAnsi="Arial" w:cs="Arial" w:eastAsia="Arial"/>
+          <w:b w:val="0"/>
+          <w:color w:val="C0392B"/>
+          <w:sz w:val="20"/>
+        </w:rPr>
+        <w:t xml:space="preserve">▪  </w:t>
+      </w:r>
+      <w:r>
+        <w:rPr>
+          <w:rFonts w:ascii="Arial" w:hAnsi="Arial" w:cs="Arial" w:eastAsia="Arial"/>
+          <w:b/>
+          <w:color w:val="1A2D4F"/>
+          <w:sz w:val="20"/>
+        </w:rPr>
+        <w:t>Session:</w:t>
+      </w:r>
+      <w:r>
+        <w:rPr>
+          <w:rFonts w:ascii="Arial" w:hAnsi="Arial" w:cs="Arial" w:eastAsia="Arial"/>
+          <w:b w:val="0"/>
+          <w:color w:val="444444"/>
+          <w:sz w:val="20"/>
+        </w:rPr>
+        <w:t xml:space="preserve"> The Legislature meets for 120 days in odd-numbered years (2019, 2021, 2023, 2025); a bill that has not finished every step by then is dead and must start over in a future session.</w:t>
+      </w:r>
+    </w:p>
+    <w:p>
+      <w:pPr>
+        <w:widowControl/>
+        <w:spacing w:before="0" w:after="60" w:lineRule="auto" w:line="252"/>
+        <w:ind w:left="200"/>
+      </w:pPr>
+      <w:r>
+        <w:rPr>
+          <w:rFonts w:ascii="Arial" w:hAnsi="Arial" w:cs="Arial" w:eastAsia="Arial"/>
+          <w:b w:val="0"/>
+          <w:color w:val="C0392B"/>
+          <w:sz w:val="20"/>
+        </w:rPr>
+        <w:t xml:space="preserve">▪  </w:t>
+      </w:r>
+      <w:r>
+        <w:rPr>
+          <w:rFonts w:ascii="Arial" w:hAnsi="Arial" w:cs="Arial" w:eastAsia="Arial"/>
+          <w:b/>
+          <w:color w:val="1A2D4F"/>
+          <w:sz w:val="20"/>
+        </w:rPr>
+        <w:t>Special session:</w:t>
+      </w:r>
+      <w:r>
+        <w:rPr>
+          <w:rFonts w:ascii="Arial" w:hAnsi="Arial" w:cs="Arial" w:eastAsia="Arial"/>
+          <w:b w:val="0"/>
+          <w:color w:val="444444"/>
+          <w:sz w:val="20"/>
+        </w:rPr>
+        <w:t xml:space="preserve"> A short extra meeting the governor calls for specific topics; bills that ran out of regular-session time can pass there.</w:t>
+      </w:r>
+    </w:p>
+    <w:p>
+      <w:pPr>
+        <w:widowControl/>
+        <w:spacing w:before="0" w:after="60" w:lineRule="auto" w:line="252"/>
+        <w:ind w:left="200"/>
+      </w:pPr>
+      <w:r>
+        <w:rPr>
+          <w:rFonts w:ascii="Arial" w:hAnsi="Arial" w:cs="Arial" w:eastAsia="Arial"/>
+          <w:b w:val="0"/>
+          <w:color w:val="C0392B"/>
+          <w:sz w:val="20"/>
+        </w:rPr>
+        <w:t xml:space="preserve">▪  </w:t>
+      </w:r>
+      <w:r>
+        <w:rPr>
+          <w:rFonts w:ascii="Arial" w:hAnsi="Arial" w:cs="Arial" w:eastAsia="Arial"/>
+          <w:b/>
+          <w:color w:val="1A2D4F"/>
+          <w:sz w:val="20"/>
+        </w:rPr>
+        <w:t>Sponsor:</w:t>
+      </w:r>
+      <w:r>
+        <w:rPr>
+          <w:rFonts w:ascii="Arial" w:hAnsi="Arial" w:cs="Arial" w:eastAsia="Arial"/>
+          <w:b w:val="0"/>
+          <w:color w:val="444444"/>
+          <w:sz w:val="20"/>
+        </w:rPr>
+        <w:t xml:space="preserve"> The lawmaker or committee that formally introduces a bill; a committee-sponsored bill has no single author. Cross-party sponsorship — sponsors from both parties — is one of the strongest signals a bill will pass.</w:t>
+      </w:r>
+    </w:p>
+    <w:p>
+      <w:pPr>
+        <w:widowControl/>
+        <w:spacing w:before="0" w:after="60" w:lineRule="auto" w:line="252"/>
+        <w:ind w:left="200"/>
+      </w:pPr>
+      <w:r>
+        <w:rPr>
+          <w:rFonts w:ascii="Arial" w:hAnsi="Arial" w:cs="Arial" w:eastAsia="Arial"/>
+          <w:b w:val="0"/>
+          <w:color w:val="C0392B"/>
+          <w:sz w:val="20"/>
+        </w:rPr>
+        <w:t xml:space="preserve">▪  </w:t>
+      </w:r>
+      <w:r>
+        <w:rPr>
+          <w:rFonts w:ascii="Arial" w:hAnsi="Arial" w:cs="Arial" w:eastAsia="Arial"/>
+          <w:b/>
+          <w:color w:val="1A2D4F"/>
+          <w:sz w:val="20"/>
+        </w:rPr>
+        <w:t>Statute / enacted:</w:t>
+      </w:r>
+      <w:r>
+        <w:rPr>
+          <w:rFonts w:ascii="Arial" w:hAnsi="Arial" w:cs="Arial" w:eastAsia="Arial"/>
+          <w:b w:val="0"/>
+          <w:color w:val="444444"/>
+          <w:sz w:val="20"/>
+        </w:rPr>
+        <w:t xml:space="preserve"> A statute is a law on the books; an enacted bill is one that became law. "By rule, not statute" means an agency or local authority adopted something the Legislature has not.</w:t>
+      </w:r>
+    </w:p>
+    <w:p>
+      <w:pPr>
+        <w:widowControl/>
+        <w:spacing w:before="0" w:after="60" w:lineRule="auto" w:line="252"/>
+        <w:ind w:left="200"/>
+      </w:pPr>
+      <w:r>
+        <w:rPr>
+          <w:rFonts w:ascii="Arial" w:hAnsi="Arial" w:cs="Arial" w:eastAsia="Arial"/>
+          <w:b w:val="0"/>
+          <w:color w:val="C0392B"/>
+          <w:sz w:val="20"/>
+        </w:rPr>
+        <w:t xml:space="preserve">▪  </w:t>
+      </w:r>
+      <w:r>
+        <w:rPr>
+          <w:rFonts w:ascii="Arial" w:hAnsi="Arial" w:cs="Arial" w:eastAsia="Arial"/>
+          <w:b/>
+          <w:color w:val="1A2D4F"/>
+          <w:sz w:val="20"/>
+        </w:rPr>
+        <w:t>Two-thirds majority:</w:t>
+      </w:r>
+      <w:r>
+        <w:rPr>
+          <w:rFonts w:ascii="Arial" w:hAnsi="Arial" w:cs="Arial" w:eastAsia="Arial"/>
+          <w:b w:val="0"/>
+          <w:color w:val="444444"/>
+          <w:sz w:val="20"/>
+        </w:rPr>
+        <w:t xml:space="preserve"> The constitution requires a two-thirds vote in each chamber — 28 of 42, 14 of 21 — for any measure raising revenue, including fees; a bill can win a majority and still fail this bar.</w:t>
+      </w:r>
+    </w:p>
+    <w:p>
+      <w:pPr>
+        <w:widowControl/>
+        <w:spacing w:before="0" w:after="60" w:lineRule="auto" w:line="252"/>
+        <w:ind w:left="200"/>
+      </w:pPr>
+      <w:r>
+        <w:rPr>
+          <w:rFonts w:ascii="Arial" w:hAnsi="Arial" w:cs="Arial" w:eastAsia="Arial"/>
+          <w:b w:val="0"/>
+          <w:color w:val="C0392B"/>
+          <w:sz w:val="20"/>
+        </w:rPr>
+        <w:t xml:space="preserve">▪  </w:t>
+      </w:r>
+      <w:r>
+        <w:rPr>
+          <w:rFonts w:ascii="Arial" w:hAnsi="Arial" w:cs="Arial" w:eastAsia="Arial"/>
+          <w:b/>
+          <w:color w:val="1A2D4F"/>
+          <w:sz w:val="20"/>
+        </w:rPr>
+        <w:t>Veto:</w:t>
+      </w:r>
+      <w:r>
+        <w:rPr>
+          <w:rFonts w:ascii="Arial" w:hAnsi="Arial" w:cs="Arial" w:eastAsia="Arial"/>
+          <w:b w:val="0"/>
+          <w:color w:val="444444"/>
+          <w:sz w:val="20"/>
+        </w:rPr>
+        <w:t xml:space="preserve"> The governor's rejection of a bill that passed both chambers. A vetoed bill does not become law unless two-thirds of each chamber votes to override the veto.</w:t>
+      </w:r>
+    </w:p>
+    <w:p>
+      <w:pPr>
+        <w:widowControl/>
+        <w:spacing w:before="0" w:after="60" w:lineRule="auto" w:line="252"/>
+        <w:ind w:left="200"/>
+      </w:pPr>
+      <w:r>
+        <w:rPr>
+          <w:rFonts w:ascii="Arial" w:hAnsi="Arial" w:cs="Arial" w:eastAsia="Arial"/>
+          <w:b w:val="0"/>
+          <w:color w:val="C0392B"/>
+          <w:sz w:val="20"/>
+        </w:rPr>
+        <w:t xml:space="preserve">▪  </w:t>
+      </w:r>
+      <w:r>
+        <w:rPr>
+          <w:rFonts w:ascii="Arial" w:hAnsi="Arial" w:cs="Arial" w:eastAsia="Arial"/>
+          <w:b/>
+          <w:color w:val="1A2D4F"/>
+          <w:sz w:val="20"/>
+        </w:rPr>
+        <w:t>Vote pairs such as "42–0 and 21–0":</w:t>
+      </w:r>
+      <w:r>
+        <w:rPr>
+          <w:rFonts w:ascii="Arial" w:hAnsi="Arial" w:cs="Arial" w:eastAsia="Arial"/>
+          <w:b w:val="0"/>
+          <w:color w:val="444444"/>
+          <w:sz w:val="20"/>
+        </w:rPr>
+        <w:t xml:space="preserve"> Floor votes are yes–no tallies, one per chamber; 42–0 is a unanimous Assembly vote, 21–0 a unanimous Senate vote.</w:t>
+      </w:r>
+    </w:p>
+    <w:p>
+      <w:pPr>
+        <w:sectPr>
+          <w:type w:val="continuous"/>
+          <w:pgSz w:w="12240" w:h="15840"/>
+          <w:pgMar w:top="864" w:right="864" w:bottom="864" w:left="864" w:header="720" w:footer="720" w:gutter="0"/>
+          <w:cols w:space="300" w:num="2"/>
+          <w:docGrid w:linePitch="360"/>
+        </w:sectPr>
+      </w:pPr>
     </w:p>
     <w:p>
       <w:pPr>
@@ -1275,9 +1966,10 @@
       </w:r>
     </w:p>
     <w:sectPr>
+      <w:type w:val="continuous"/>
       <w:pgSz w:w="12240" w:h="15840"/>
       <w:pgMar w:top="864" w:right="864" w:bottom="864" w:left="864" w:header="720" w:footer="720" w:gutter="0"/>
-      <w:cols w:space="720"/>
+      <w:cols w:space="300" w:num="1"/>
       <w:docGrid w:linePitch="360"/>
     </w:sectPr>
   </w:body>

</xml_diff>

<commit_message>
Glossaries: separate the legislative process guide onto its own page; condense entries to hold 2 Word pages
Co-authored-by: CaptainWrechols <CaptainWrechols@users.noreply.github.com>
</commit_message>
<xml_diff>
--- a/briefs/nevada/cost-of-living/citizen-v3/glossary.docx
+++ b/briefs/nevada/cost-of-living/citizen-v3/glossary.docx
@@ -54,18 +54,8 @@
           <w:color w:val="444444"/>
           <w:sz w:val="20"/>
         </w:rPr>
-        <w:t>Plain-language definitions of the terms and acronyms in "The Rising Cost of Living in Nevada: Health Care" (citizen brief v3.0), followed by the legislative process guide shared by all four briefs.</w:t>
+        <w:t>Plain-language definitions of this brief's terms and acronyms; the shared legislative process guide follows.</w:t>
       </w:r>
-    </w:p>
-    <w:p>
-      <w:pPr>
-        <w:sectPr>
-          <w:pgSz w:w="12240" w:h="15840"/>
-          <w:pgMar w:top="864" w:right="864" w:bottom="864" w:left="864" w:header="720" w:footer="720" w:gutter="0"/>
-          <w:cols w:space="720"/>
-          <w:docGrid w:linePitch="360"/>
-        </w:sectPr>
-      </w:pPr>
     </w:p>
     <w:p>
       <w:pPr>
@@ -85,8 +75,18 @@
     </w:p>
     <w:p>
       <w:pPr>
+        <w:sectPr>
+          <w:pgSz w:w="12240" w:h="15840"/>
+          <w:pgMar w:top="864" w:right="864" w:bottom="864" w:left="864" w:header="720" w:footer="720" w:gutter="0"/>
+          <w:cols w:space="720"/>
+          <w:docGrid w:linePitch="360"/>
+        </w:sectPr>
+      </w:pPr>
+    </w:p>
+    <w:p>
+      <w:pPr>
         <w:widowControl/>
-        <w:spacing w:before="0" w:after="60" w:lineRule="auto" w:line="252"/>
+        <w:spacing w:before="0" w:after="44" w:lineRule="auto" w:line="240"/>
         <w:ind w:left="200"/>
       </w:pPr>
       <w:r>
@@ -114,13 +114,13 @@
           <w:color w:val="444444"/>
           <w:sz w:val="20"/>
         </w:rPr>
-        <w:t xml:space="preserve"> A federal program letting hospitals and clinics serving low-income patients buy drugs at deep discounts.</w:t>
+        <w:t xml:space="preserve"> A federal program letting safety-net hospitals and clinics buy drugs at deep discounts.</w:t>
       </w:r>
     </w:p>
     <w:p>
       <w:pPr>
         <w:widowControl/>
-        <w:spacing w:before="0" w:after="60" w:lineRule="auto" w:line="252"/>
+        <w:spacing w:before="0" w:after="44" w:lineRule="auto" w:line="240"/>
         <w:ind w:left="200"/>
       </w:pPr>
       <w:r>
@@ -148,13 +148,13 @@
           <w:color w:val="444444"/>
           <w:sz w:val="20"/>
         </w:rPr>
-        <w:t xml:space="preserve"> Letting small businesses or unrelated groups band together to buy insurance at large-group prices — never filed.</w:t>
+        <w:t xml:space="preserve"> Small businesses or unrelated groups banding together to buy insurance at large-group prices — never filed.</w:t>
       </w:r>
     </w:p>
     <w:p>
       <w:pPr>
         <w:widowControl/>
-        <w:spacing w:before="0" w:after="60" w:lineRule="auto" w:line="252"/>
+        <w:spacing w:before="0" w:after="44" w:lineRule="auto" w:line="240"/>
         <w:ind w:left="200"/>
       </w:pPr>
       <w:r>
@@ -182,13 +182,47 @@
           <w:color w:val="444444"/>
           <w:sz w:val="20"/>
         </w:rPr>
-        <w:t xml:space="preserve"> A neutral process settling insurer–provider payment disputes outside court; forced arbitration — the vetoed-bill subject — is a policy clause stripping the patient's right to sue.</w:t>
+        <w:t xml:space="preserve"> A neutral process settling insurer–provider payment disputes out of court; forced arbitration — the vetoed-bill subject — strips the patient's right to sue.</w:t>
       </w:r>
     </w:p>
     <w:p>
       <w:pPr>
         <w:widowControl/>
-        <w:spacing w:before="0" w:after="60" w:lineRule="auto" w:line="252"/>
+        <w:spacing w:before="0" w:after="44" w:lineRule="auto" w:line="240"/>
+        <w:ind w:left="200"/>
+      </w:pPr>
+      <w:r>
+        <w:rPr>
+          <w:rFonts w:ascii="Arial" w:hAnsi="Arial" w:cs="Arial" w:eastAsia="Arial"/>
+          <w:b w:val="0"/>
+          <w:color w:val="C0392B"/>
+          <w:sz w:val="20"/>
+        </w:rPr>
+        <w:t xml:space="preserve">▪  </w:t>
+      </w:r>
+      <w:r>
+        <w:rPr>
+          <w:rFonts w:ascii="Arial" w:hAnsi="Arial" w:cs="Arial" w:eastAsia="Arial"/>
+          <w:b/>
+          <w:color w:val="1A2D4F"/>
+          <w:sz w:val="20"/>
+        </w:rPr>
+        <w:t>Credentialing:</w:t>
+      </w:r>
+      <w:r>
+        <w:rPr>
+          <w:rFonts w:ascii="Arial" w:hAnsi="Arial" w:cs="Arial" w:eastAsia="Arial"/>
+          <w:b w:val="0"/>
+          <w:color w:val="444444"/>
+          <w:sz w:val="20"/>
+        </w:rPr>
+        <w:t xml:space="preserve"> An insurer's vetting process for adding a provider to its network; delays keep new providers from insured patients for months.</w:t>
+      </w:r>
+    </w:p>
+    <w:p>
+      <w:pPr>
+        <w:widowControl/>
+        <w:spacing w:before="0" w:after="44" w:lineRule="auto" w:line="240"/>
         <w:ind w:left="200"/>
       </w:pPr>
       <w:r>
@@ -222,41 +256,7 @@
     <w:p>
       <w:pPr>
         <w:widowControl/>
-        <w:spacing w:before="0" w:after="60" w:lineRule="auto" w:line="252"/>
-        <w:ind w:left="200"/>
-      </w:pPr>
-      <w:r>
-        <w:rPr>
-          <w:rFonts w:ascii="Arial" w:hAnsi="Arial" w:cs="Arial" w:eastAsia="Arial"/>
-          <w:b w:val="0"/>
-          <w:color w:val="C0392B"/>
-          <w:sz w:val="20"/>
-        </w:rPr>
-        <w:t xml:space="preserve">▪  </w:t>
-      </w:r>
-      <w:r>
-        <w:rPr>
-          <w:rFonts w:ascii="Arial" w:hAnsi="Arial" w:cs="Arial" w:eastAsia="Arial"/>
-          <w:b/>
-          <w:color w:val="1A2D4F"/>
-          <w:sz w:val="20"/>
-        </w:rPr>
-        <w:t>Credentialing:</w:t>
-      </w:r>
-      <w:r>
-        <w:rPr>
-          <w:rFonts w:ascii="Arial" w:hAnsi="Arial" w:cs="Arial" w:eastAsia="Arial"/>
-          <w:b w:val="0"/>
-          <w:color w:val="444444"/>
-          <w:sz w:val="20"/>
-        </w:rPr>
-        <w:t xml:space="preserve"> An insurer's vetting process for adding a provider to its network; slow credentialing keeps new providers from insured patients for months.</w:t>
-      </w:r>
-    </w:p>
-    <w:p>
-      <w:pPr>
-        <w:widowControl/>
-        <w:spacing w:before="0" w:after="60" w:lineRule="auto" w:line="252"/>
+        <w:spacing w:before="0" w:after="44" w:lineRule="auto" w:line="240"/>
         <w:ind w:left="200"/>
       </w:pPr>
       <w:r>
@@ -284,13 +284,13 @@
           <w:color w:val="444444"/>
           <w:sz w:val="20"/>
         </w:rPr>
-        <w:t xml:space="preserve"> A licensed midlevel dental profession — more training than a hygienist, less than a dentist.</w:t>
+        <w:t xml:space="preserve"> A licensed midlevel dental profession — between hygienist and dentist.</w:t>
       </w:r>
     </w:p>
     <w:p>
       <w:pPr>
         <w:widowControl/>
-        <w:spacing w:before="0" w:after="60" w:lineRule="auto" w:line="252"/>
+        <w:spacing w:before="0" w:after="44" w:lineRule="auto" w:line="240"/>
         <w:ind w:left="200"/>
       </w:pPr>
       <w:r>
@@ -324,7 +324,7 @@
     <w:p>
       <w:pPr>
         <w:widowControl/>
-        <w:spacing w:before="0" w:after="60" w:lineRule="auto" w:line="252"/>
+        <w:spacing w:before="0" w:after="44" w:lineRule="auto" w:line="240"/>
         <w:ind w:left="200"/>
       </w:pPr>
       <w:r>
@@ -352,81 +352,13 @@
           <w:color w:val="444444"/>
           <w:sz w:val="20"/>
         </w:rPr>
-        <w:t xml:space="preserve"> Emergency room versus walk-in clinic; ER visits carry hospital-level charges even for minor problems — why participants proposed splitting the billing.</w:t>
+        <w:t xml:space="preserve"> Emergency room versus walk-in clinic; ER visits carry hospital-level charges even for minor problems.</w:t>
       </w:r>
     </w:p>
     <w:p>
       <w:pPr>
         <w:widowControl/>
-        <w:spacing w:before="0" w:after="60" w:lineRule="auto" w:line="252"/>
-        <w:ind w:left="200"/>
-      </w:pPr>
-      <w:r>
-        <w:rPr>
-          <w:rFonts w:ascii="Arial" w:hAnsi="Arial" w:cs="Arial" w:eastAsia="Arial"/>
-          <w:b w:val="0"/>
-          <w:color w:val="C0392B"/>
-          <w:sz w:val="20"/>
-        </w:rPr>
-        <w:t xml:space="preserve">▪  </w:t>
-      </w:r>
-      <w:r>
-        <w:rPr>
-          <w:rFonts w:ascii="Arial" w:hAnsi="Arial" w:cs="Arial" w:eastAsia="Arial"/>
-          <w:b/>
-          <w:color w:val="1A2D4F"/>
-          <w:sz w:val="20"/>
-        </w:rPr>
-        <w:t>ERISA:</w:t>
-      </w:r>
-      <w:r>
-        <w:rPr>
-          <w:rFonts w:ascii="Arial" w:hAnsi="Arial" w:cs="Arial" w:eastAsia="Arial"/>
-          <w:b w:val="0"/>
-          <w:color w:val="444444"/>
-          <w:sz w:val="20"/>
-        </w:rPr>
-        <w:t xml:space="preserve"> The federal Employee Retirement Income Security Act, which puts self-funded employer health plans under federal — not state — regulation.</w:t>
-      </w:r>
-    </w:p>
-    <w:p>
-      <w:pPr>
-        <w:widowControl/>
-        <w:spacing w:before="0" w:after="60" w:lineRule="auto" w:line="252"/>
-        <w:ind w:left="200"/>
-      </w:pPr>
-      <w:r>
-        <w:rPr>
-          <w:rFonts w:ascii="Arial" w:hAnsi="Arial" w:cs="Arial" w:eastAsia="Arial"/>
-          <w:b w:val="0"/>
-          <w:color w:val="C0392B"/>
-          <w:sz w:val="20"/>
-        </w:rPr>
-        <w:t xml:space="preserve">▪  </w:t>
-      </w:r>
-      <w:r>
-        <w:rPr>
-          <w:rFonts w:ascii="Arial" w:hAnsi="Arial" w:cs="Arial" w:eastAsia="Arial"/>
-          <w:b/>
-          <w:color w:val="1A2D4F"/>
-          <w:sz w:val="20"/>
-        </w:rPr>
-        <w:t>Federal prior-authorization rules:</w:t>
-      </w:r>
-      <w:r>
-        <w:rPr>
-          <w:rFonts w:ascii="Arial" w:hAnsi="Arial" w:cs="Arial" w:eastAsia="Arial"/>
-          <w:b w:val="0"/>
-          <w:color w:val="444444"/>
-          <w:sz w:val="20"/>
-        </w:rPr>
-        <w:t xml:space="preserve"> 2024 federal rules imposing decision deadlines on Medicare Advantage, Medicaid, and exchange plans through 2027; Nevada's law covers the plans they miss.</w:t>
-      </w:r>
-    </w:p>
-    <w:p>
-      <w:pPr>
-        <w:widowControl/>
-        <w:spacing w:before="0" w:after="60" w:lineRule="auto" w:line="252"/>
+        <w:spacing w:before="0" w:after="44" w:lineRule="auto" w:line="240"/>
         <w:ind w:left="200"/>
       </w:pPr>
       <w:r>
@@ -454,13 +386,13 @@
           <w:color w:val="444444"/>
           <w:sz w:val="20"/>
         </w:rPr>
-        <w:t xml:space="preserve"> Doctors trained abroad, whose path to full Nevada licensure was eased in 2025.</w:t>
+        <w:t xml:space="preserve"> Doctors trained abroad; their path to full Nevada licensure was eased in 2025.</w:t>
       </w:r>
     </w:p>
     <w:p>
       <w:pPr>
         <w:widowControl/>
-        <w:spacing w:before="0" w:after="60" w:lineRule="auto" w:line="252"/>
+        <w:spacing w:before="0" w:after="44" w:lineRule="auto" w:line="240"/>
         <w:ind w:left="200"/>
       </w:pPr>
       <w:r>
@@ -488,13 +420,13 @@
           <w:color w:val="444444"/>
           <w:sz w:val="20"/>
         </w:rPr>
-        <w:t xml:space="preserve"> A contract term barring pharmacists from volunteering that paying cash would be cheaper than insurance; now banned in Nevada.</w:t>
+        <w:t xml:space="preserve"> A contract term barring pharmacists from saying cash would be cheaper than insurance; now banned in Nevada.</w:t>
       </w:r>
     </w:p>
     <w:p>
       <w:pPr>
         <w:widowControl/>
-        <w:spacing w:before="0" w:after="60" w:lineRule="auto" w:line="252"/>
+        <w:spacing w:before="0" w:after="44" w:lineRule="auto" w:line="240"/>
         <w:ind w:left="200"/>
       </w:pPr>
       <w:r>
@@ -522,13 +454,13 @@
           <w:color w:val="444444"/>
           <w:sz w:val="20"/>
         </w:rPr>
-        <w:t xml:space="preserve"> Nevada's loan-repayment program for providers who commit to underserved areas.</w:t>
+        <w:t xml:space="preserve"> Nevada's loan-repayment program for providers committing to underserved areas.</w:t>
       </w:r>
     </w:p>
     <w:p>
       <w:pPr>
         <w:widowControl/>
-        <w:spacing w:before="0" w:after="60" w:lineRule="auto" w:line="252"/>
+        <w:spacing w:before="0" w:after="44" w:lineRule="auto" w:line="240"/>
         <w:ind w:left="200"/>
       </w:pPr>
       <w:r>
@@ -556,13 +488,13 @@
           <w:color w:val="444444"/>
           <w:sz w:val="20"/>
         </w:rPr>
-        <w:t xml:space="preserve"> Health and Human Services, as in the Senate and Assembly HHS committees.</w:t>
+        <w:t xml:space="preserve"> Health and Human Services — the Senate and Assembly HHS committees.</w:t>
       </w:r>
     </w:p>
     <w:p>
       <w:pPr>
         <w:widowControl/>
-        <w:spacing w:before="0" w:after="60" w:lineRule="auto" w:line="252"/>
+        <w:spacing w:before="0" w:after="44" w:lineRule="auto" w:line="240"/>
         <w:ind w:left="200"/>
       </w:pPr>
       <w:r>
@@ -590,13 +522,13 @@
           <w:color w:val="444444"/>
           <w:sz w:val="20"/>
         </w:rPr>
-        <w:t xml:space="preserve"> An agreement among states to honor each other's professional licenses across member states; the Nurse Licensure Compact is the nursing version — the one compact Nevada has not joined.</w:t>
+        <w:t xml:space="preserve"> States agreeing to honor each other's professional licenses; the Nurse Licensure Compact is the nursing version — the one compact Nevada has not joined.</w:t>
       </w:r>
     </w:p>
     <w:p>
       <w:pPr>
         <w:widowControl/>
-        <w:spacing w:before="0" w:after="60" w:lineRule="auto" w:line="252"/>
+        <w:spacing w:before="0" w:after="44" w:lineRule="auto" w:line="240"/>
         <w:ind w:left="200"/>
       </w:pPr>
       <w:r>
@@ -624,13 +556,13 @@
           <w:color w:val="444444"/>
           <w:sz w:val="20"/>
         </w:rPr>
-        <w:t xml:space="preserve"> The state-federal insurance program for lower-income Nevadans and its companion Children's Health Insurance Program; the state sets many of its rules, so many bills target it.</w:t>
+        <w:t xml:space="preserve"> The state-federal program for lower-income Nevadans and its companion Children's Health Insurance Program; the state sets many of its rules, so many bills target it.</w:t>
       </w:r>
     </w:p>
     <w:p>
       <w:pPr>
         <w:widowControl/>
-        <w:spacing w:before="0" w:after="60" w:lineRule="auto" w:line="252"/>
+        <w:spacing w:before="0" w:after="44" w:lineRule="auto" w:line="240"/>
         <w:ind w:left="200"/>
       </w:pPr>
       <w:r>
@@ -664,7 +596,7 @@
     <w:p>
       <w:pPr>
         <w:widowControl/>
-        <w:spacing w:before="0" w:after="60" w:lineRule="auto" w:line="252"/>
+        <w:spacing w:before="0" w:after="44" w:lineRule="auto" w:line="240"/>
         <w:ind w:left="200"/>
       </w:pPr>
       <w:r>
@@ -683,7 +615,7 @@
           <w:color w:val="1A2D4F"/>
           <w:sz w:val="20"/>
         </w:rPr>
-        <w:t>Medicare:</w:t>
+        <w:t>Medicare / Medicare-negotiated prices:</w:t>
       </w:r>
       <w:r>
         <w:rPr>
@@ -692,13 +624,13 @@
           <w:color w:val="444444"/>
           <w:sz w:val="20"/>
         </w:rPr>
-        <w:t xml:space="preserve"> The federal insurance program for people 65 and over and some with disabilities; its payment rates and drug prices are set federally.</w:t>
+        <w:t xml:space="preserve"> The federal insurance program for people 65 and over and some with disabilities; its rates and drug prices are set federally. A 2022 law lets the federal government negotiate drug prices — the first take effect in 2026, and Nevada's vetoed caps were pegged to them.</w:t>
       </w:r>
     </w:p>
     <w:p>
       <w:pPr>
         <w:widowControl/>
-        <w:spacing w:before="0" w:after="60" w:lineRule="auto" w:line="252"/>
+        <w:spacing w:before="0" w:after="44" w:lineRule="auto" w:line="240"/>
         <w:ind w:left="200"/>
       </w:pPr>
       <w:r>
@@ -717,7 +649,7 @@
           <w:color w:val="1A2D4F"/>
           <w:sz w:val="20"/>
         </w:rPr>
-        <w:t>Medicare-negotiated prices:</w:t>
+        <w:t>Network / panel / out-of-network:</w:t>
       </w:r>
       <w:r>
         <w:rPr>
@@ -726,47 +658,13 @@
           <w:color w:val="444444"/>
           <w:sz w:val="20"/>
         </w:rPr>
-        <w:t xml:space="preserve"> Drug prices the federal government negotiates with manufacturers under a 2022 law; the first take effect in 2026 — Nevada's vetoed caps were pegged to them.</w:t>
+        <w:t xml:space="preserve"> The providers under contract with an insurer; a "full panel" is not accepting new patients, and no law defines when a panel is full. An out-of-network provider has no insurer contract — the source of the biggest surprise bills.</w:t>
       </w:r>
     </w:p>
     <w:p>
       <w:pPr>
         <w:widowControl/>
-        <w:spacing w:before="0" w:after="60" w:lineRule="auto" w:line="252"/>
-        <w:ind w:left="200"/>
-      </w:pPr>
-      <w:r>
-        <w:rPr>
-          <w:rFonts w:ascii="Arial" w:hAnsi="Arial" w:cs="Arial" w:eastAsia="Arial"/>
-          <w:b w:val="0"/>
-          <w:color w:val="C0392B"/>
-          <w:sz w:val="20"/>
-        </w:rPr>
-        <w:t xml:space="preserve">▪  </w:t>
-      </w:r>
-      <w:r>
-        <w:rPr>
-          <w:rFonts w:ascii="Arial" w:hAnsi="Arial" w:cs="Arial" w:eastAsia="Arial"/>
-          <w:b/>
-          <w:color w:val="1A2D4F"/>
-          <w:sz w:val="20"/>
-        </w:rPr>
-        <w:t>Network / panel:</w:t>
-      </w:r>
-      <w:r>
-        <w:rPr>
-          <w:rFonts w:ascii="Arial" w:hAnsi="Arial" w:cs="Arial" w:eastAsia="Arial"/>
-          <w:b w:val="0"/>
-          <w:color w:val="444444"/>
-          <w:sz w:val="20"/>
-        </w:rPr>
-        <w:t xml:space="preserve"> The providers under contract with an insurer; a provider whose "panel is full" is not accepting new patients, and no law defines when a panel is full.</w:t>
-      </w:r>
-    </w:p>
-    <w:p>
-      <w:pPr>
-        <w:widowControl/>
-        <w:spacing w:before="0" w:after="60" w:lineRule="auto" w:line="252"/>
+        <w:spacing w:before="0" w:after="44" w:lineRule="auto" w:line="240"/>
         <w:ind w:left="200"/>
       </w:pPr>
       <w:r>
@@ -800,7 +698,7 @@
     <w:p>
       <w:pPr>
         <w:widowControl/>
-        <w:spacing w:before="0" w:after="60" w:lineRule="auto" w:line="252"/>
+        <w:spacing w:before="0" w:after="44" w:lineRule="auto" w:line="240"/>
         <w:ind w:left="200"/>
       </w:pPr>
       <w:r>
@@ -828,47 +726,13 @@
           <w:color w:val="444444"/>
           <w:sz w:val="20"/>
         </w:rPr>
-        <w:t xml:space="preserve"> The 2022 federal law protecting patients nationwide from surprise out-of-network emergency bills.</w:t>
+        <w:t xml:space="preserve"> The 2022 federal law protecting patients from surprise out-of-network emergency bills.</w:t>
       </w:r>
     </w:p>
     <w:p>
       <w:pPr>
         <w:widowControl/>
-        <w:spacing w:before="0" w:after="60" w:lineRule="auto" w:line="252"/>
-        <w:ind w:left="200"/>
-      </w:pPr>
-      <w:r>
-        <w:rPr>
-          <w:rFonts w:ascii="Arial" w:hAnsi="Arial" w:cs="Arial" w:eastAsia="Arial"/>
-          <w:b w:val="0"/>
-          <w:color w:val="C0392B"/>
-          <w:sz w:val="20"/>
-        </w:rPr>
-        <w:t xml:space="preserve">▪  </w:t>
-      </w:r>
-      <w:r>
-        <w:rPr>
-          <w:rFonts w:ascii="Arial" w:hAnsi="Arial" w:cs="Arial" w:eastAsia="Arial"/>
-          <w:b/>
-          <w:color w:val="1A2D4F"/>
-          <w:sz w:val="20"/>
-        </w:rPr>
-        <w:t>Out-of-network:</w:t>
-      </w:r>
-      <w:r>
-        <w:rPr>
-          <w:rFonts w:ascii="Arial" w:hAnsi="Arial" w:cs="Arial" w:eastAsia="Arial"/>
-          <w:b w:val="0"/>
-          <w:color w:val="444444"/>
-          <w:sz w:val="20"/>
-        </w:rPr>
-        <w:t xml:space="preserve"> A provider with no contract with the patient's insurer — the source of the highest surprise bills.</w:t>
-      </w:r>
-    </w:p>
-    <w:p>
-      <w:pPr>
-        <w:widowControl/>
-        <w:spacing w:before="0" w:after="60" w:lineRule="auto" w:line="252"/>
+        <w:spacing w:before="0" w:after="44" w:lineRule="auto" w:line="240"/>
         <w:ind w:left="200"/>
       </w:pPr>
       <w:r>
@@ -896,13 +760,13 @@
           <w:color w:val="444444"/>
           <w:sz w:val="20"/>
         </w:rPr>
-        <w:t xml:space="preserve"> A middleman hired by insurers to run drug benefits — choosing covered drugs, negotiating drugmaker rebates, and setting pharmacy payments — a major driver of what patients pay at the counter.</w:t>
+        <w:t xml:space="preserve"> A middleman hired by insurers to run drug benefits — choosing covered drugs, negotiating drugmaker rebates, and setting pharmacy payments — a major driver of what patients pay.</w:t>
       </w:r>
     </w:p>
     <w:p>
       <w:pPr>
         <w:widowControl/>
-        <w:spacing w:before="0" w:after="60" w:lineRule="auto" w:line="252"/>
+        <w:spacing w:before="0" w:after="44" w:lineRule="auto" w:line="240"/>
         <w:ind w:left="200"/>
       </w:pPr>
       <w:r>
@@ -930,13 +794,13 @@
           <w:color w:val="444444"/>
           <w:sz w:val="20"/>
         </w:rPr>
-        <w:t xml:space="preserve"> Requiring a doctor to get insurer approval before a treatment or prescription is covered.</w:t>
+        <w:t xml:space="preserve"> Requiring insurer approval before a treatment or prescription is covered; 2024 federal rules impose decision deadlines on Medicare Advantage, Medicaid, and exchange plans through 2027, and Nevada's law covers the plans they miss.</w:t>
       </w:r>
     </w:p>
     <w:p>
       <w:pPr>
         <w:widowControl/>
-        <w:spacing w:before="0" w:after="60" w:lineRule="auto" w:line="252"/>
+        <w:spacing w:before="0" w:after="44" w:lineRule="auto" w:line="240"/>
         <w:ind w:left="200"/>
       </w:pPr>
       <w:r>
@@ -964,13 +828,13 @@
           <w:color w:val="444444"/>
           <w:sz w:val="20"/>
         </w:rPr>
-        <w:t xml:space="preserve"> A fee on providers used to draw federal matching money — funding higher Medicaid payments without state general-fund dollars.</w:t>
+        <w:t xml:space="preserve"> A fee on providers that draws federal matching money — funding higher Medicaid payments without state general-fund dollars.</w:t>
       </w:r>
     </w:p>
     <w:p>
       <w:pPr>
         <w:widowControl/>
-        <w:spacing w:before="0" w:after="60" w:lineRule="auto" w:line="252"/>
+        <w:spacing w:before="0" w:after="44" w:lineRule="auto" w:line="240"/>
         <w:ind w:left="200"/>
       </w:pPr>
       <w:r>
@@ -1004,7 +868,7 @@
     <w:p>
       <w:pPr>
         <w:widowControl/>
-        <w:spacing w:before="0" w:after="60" w:lineRule="auto" w:line="252"/>
+        <w:spacing w:before="0" w:after="44" w:lineRule="auto" w:line="240"/>
         <w:ind w:left="200"/>
       </w:pPr>
       <w:r>
@@ -1032,13 +896,13 @@
           <w:color w:val="444444"/>
           <w:sz w:val="20"/>
         </w:rPr>
-        <w:t xml:space="preserve"> Passing the discounts drugmakers pay PBMs along to the payer, as Nevada requires for Medicaid.</w:t>
+        <w:t xml:space="preserve"> Passing drugmaker discounts paid to PBMs along to the payer, as Nevada requires for Medicaid.</w:t>
       </w:r>
     </w:p>
     <w:p>
       <w:pPr>
         <w:widowControl/>
-        <w:spacing w:before="0" w:after="60" w:lineRule="auto" w:line="252"/>
+        <w:spacing w:before="0" w:after="44" w:lineRule="auto" w:line="240"/>
         <w:ind w:left="200"/>
       </w:pPr>
       <w:r>
@@ -1066,13 +930,13 @@
           <w:color w:val="444444"/>
           <w:sz w:val="20"/>
         </w:rPr>
-        <w:t xml:space="preserve"> State grants aimed at provider shortages, enacted in the 2025 special session.</w:t>
+        <w:t xml:space="preserve"> State grants against provider shortages, enacted in the 2025 special session.</w:t>
       </w:r>
     </w:p>
     <w:p>
       <w:pPr>
         <w:widowControl/>
-        <w:spacing w:before="0" w:after="60" w:lineRule="auto" w:line="252"/>
+        <w:spacing w:before="0" w:after="44" w:lineRule="auto" w:line="240"/>
         <w:ind w:left="200"/>
       </w:pPr>
       <w:r>
@@ -1100,13 +964,13 @@
           <w:color w:val="444444"/>
           <w:sz w:val="20"/>
         </w:rPr>
-        <w:t xml:space="preserve"> What an insurer or program pays a provider; low rates are why some providers do not accept Medicaid patients.</w:t>
+        <w:t xml:space="preserve"> What an insurer or program pays a provider; low rates are why some providers decline Medicaid patients.</w:t>
       </w:r>
     </w:p>
     <w:p>
       <w:pPr>
         <w:widowControl/>
-        <w:spacing w:before="0" w:after="60" w:lineRule="auto" w:line="252"/>
+        <w:spacing w:before="0" w:after="44" w:lineRule="auto" w:line="240"/>
         <w:ind w:left="200"/>
       </w:pPr>
       <w:r>
@@ -1134,13 +998,13 @@
           <w:color w:val="444444"/>
           <w:sz w:val="20"/>
         </w:rPr>
-        <w:t xml:space="preserve"> Supervised hospital training after medical school — the bottleneck for growing the doctor supply and the target of Nevada's residency grants.</w:t>
+        <w:t xml:space="preserve"> Supervised hospital training after medical school — the doctor-supply bottleneck and the target of Nevada's residency grants.</w:t>
       </w:r>
     </w:p>
     <w:p>
       <w:pPr>
         <w:widowControl/>
-        <w:spacing w:before="0" w:after="60" w:lineRule="auto" w:line="252"/>
+        <w:spacing w:before="0" w:after="44" w:lineRule="auto" w:line="240"/>
         <w:ind w:left="200"/>
       </w:pPr>
       <w:r>
@@ -1159,7 +1023,7 @@
           <w:color w:val="1A2D4F"/>
           <w:sz w:val="20"/>
         </w:rPr>
-        <w:t>Self-funded employer plan:</w:t>
+        <w:t>Self-funded employer plan / ERISA:</w:t>
       </w:r>
       <w:r>
         <w:rPr>
@@ -1168,13 +1032,13 @@
           <w:color w:val="444444"/>
           <w:sz w:val="20"/>
         </w:rPr>
-        <w:t xml:space="preserve"> A plan where the employer pays claims itself; most large-employer coverage works this way, beyond state regulation (see ERISA).</w:t>
+        <w:t xml:space="preserve"> A plan where the employer pays claims itself; most large-employer coverage works this way, under the federal ERISA law (Employee Retirement Income Security Act), not the state.</w:t>
       </w:r>
     </w:p>
     <w:p>
       <w:pPr>
         <w:widowControl/>
-        <w:spacing w:before="0" w:after="60" w:lineRule="auto" w:line="252"/>
+        <w:spacing w:before="0" w:after="44" w:lineRule="auto" w:line="240"/>
         <w:ind w:left="200"/>
       </w:pPr>
       <w:r>
@@ -1202,13 +1066,13 @@
           <w:color w:val="444444"/>
           <w:sz w:val="20"/>
         </w:rPr>
-        <w:t xml:space="preserve"> Requiring a patient to try cheaper drugs first — and "fail" on them — before the prescribed one is covered.</w:t>
+        <w:t xml:space="preserve"> Trying cheaper drugs first — and "failing" on them — before the prescribed one is covered.</w:t>
       </w:r>
     </w:p>
     <w:p>
       <w:pPr>
         <w:widowControl/>
-        <w:spacing w:before="0" w:after="60" w:lineRule="auto" w:line="252"/>
+        <w:spacing w:before="0" w:after="44" w:lineRule="auto" w:line="240"/>
         <w:ind w:left="200"/>
       </w:pPr>
       <w:r>
@@ -1236,13 +1100,13 @@
           <w:color w:val="444444"/>
           <w:sz w:val="20"/>
         </w:rPr>
-        <w:t xml:space="preserve"> Care delivered by video or phone; settled Nevada law.</w:t>
+        <w:t xml:space="preserve"> Video or phone care; settled Nevada law.</w:t>
       </w:r>
     </w:p>
     <w:p>
       <w:pPr>
         <w:widowControl/>
-        <w:spacing w:before="0" w:after="60" w:lineRule="auto" w:line="252"/>
+        <w:spacing w:before="0" w:after="44" w:lineRule="auto" w:line="240"/>
         <w:ind w:left="200"/>
       </w:pPr>
       <w:r>
@@ -1270,8 +1134,19 @@
           <w:color w:val="444444"/>
           <w:sz w:val="20"/>
         </w:rPr>
-        <w:t xml:space="preserve"> The federal health program for military members, retirees, and their families.</w:t>
+        <w:t xml:space="preserve"> The federal health program for military members, retirees, and families.</w:t>
       </w:r>
+    </w:p>
+    <w:p>
+      <w:pPr>
+        <w:sectPr>
+          <w:type w:val="continuous"/>
+          <w:pgSz w:w="12240" w:h="15840"/>
+          <w:pgMar w:top="864" w:right="864" w:bottom="864" w:left="864" w:header="720" w:footer="720" w:gutter="0"/>
+          <w:cols w:space="240" w:num="2"/>
+          <w:docGrid w:linePitch="360"/>
+        </w:sectPr>
+      </w:pPr>
     </w:p>
     <w:p>
       <w:pPr>
@@ -1291,8 +1166,18 @@
     </w:p>
     <w:p>
       <w:pPr>
+        <w:sectPr>
+          <w:pgSz w:w="12240" w:h="15840"/>
+          <w:pgMar w:top="864" w:right="864" w:bottom="864" w:left="864" w:header="720" w:footer="720" w:gutter="0"/>
+          <w:cols w:space="240" w:num="1"/>
+          <w:docGrid w:linePitch="360"/>
+        </w:sectPr>
+      </w:pPr>
+    </w:p>
+    <w:p>
+      <w:pPr>
         <w:widowControl/>
-        <w:spacing w:before="0" w:after="60" w:lineRule="auto" w:line="252"/>
+        <w:spacing w:before="0" w:after="44" w:lineRule="auto" w:line="240"/>
         <w:ind w:left="200"/>
       </w:pPr>
       <w:r>
@@ -1326,7 +1211,7 @@
     <w:p>
       <w:pPr>
         <w:widowControl/>
-        <w:spacing w:before="0" w:after="60" w:lineRule="auto" w:line="252"/>
+        <w:spacing w:before="0" w:after="44" w:lineRule="auto" w:line="240"/>
         <w:ind w:left="200"/>
       </w:pPr>
       <w:r>
@@ -1360,7 +1245,7 @@
     <w:p>
       <w:pPr>
         <w:widowControl/>
-        <w:spacing w:before="0" w:after="60" w:lineRule="auto" w:line="252"/>
+        <w:spacing w:before="0" w:after="44" w:lineRule="auto" w:line="240"/>
         <w:ind w:left="200"/>
       </w:pPr>
       <w:r>
@@ -1394,7 +1279,7 @@
     <w:p>
       <w:pPr>
         <w:widowControl/>
-        <w:spacing w:before="0" w:after="60" w:lineRule="auto" w:line="252"/>
+        <w:spacing w:before="0" w:after="44" w:lineRule="auto" w:line="240"/>
         <w:ind w:left="200"/>
       </w:pPr>
       <w:r>
@@ -1428,7 +1313,7 @@
     <w:p>
       <w:pPr>
         <w:widowControl/>
-        <w:spacing w:before="0" w:after="60" w:lineRule="auto" w:line="252"/>
+        <w:spacing w:before="0" w:after="44" w:lineRule="auto" w:line="240"/>
         <w:ind w:left="200"/>
       </w:pPr>
       <w:r>
@@ -1462,7 +1347,7 @@
     <w:p>
       <w:pPr>
         <w:widowControl/>
-        <w:spacing w:before="0" w:after="60" w:lineRule="auto" w:line="252"/>
+        <w:spacing w:before="0" w:after="44" w:lineRule="auto" w:line="240"/>
         <w:ind w:left="200"/>
       </w:pPr>
       <w:r>
@@ -1496,7 +1381,7 @@
     <w:p>
       <w:pPr>
         <w:widowControl/>
-        <w:spacing w:before="0" w:after="60" w:lineRule="auto" w:line="252"/>
+        <w:spacing w:before="0" w:after="44" w:lineRule="auto" w:line="240"/>
         <w:ind w:left="200"/>
       </w:pPr>
       <w:r>
@@ -1530,7 +1415,7 @@
     <w:p>
       <w:pPr>
         <w:widowControl/>
-        <w:spacing w:before="0" w:after="60" w:lineRule="auto" w:line="252"/>
+        <w:spacing w:before="0" w:after="44" w:lineRule="auto" w:line="240"/>
         <w:ind w:left="200"/>
       </w:pPr>
       <w:r>
@@ -1564,7 +1449,7 @@
     <w:p>
       <w:pPr>
         <w:widowControl/>
-        <w:spacing w:before="0" w:after="60" w:lineRule="auto" w:line="252"/>
+        <w:spacing w:before="0" w:after="44" w:lineRule="auto" w:line="240"/>
         <w:ind w:left="200"/>
       </w:pPr>
       <w:r>
@@ -1598,7 +1483,7 @@
     <w:p>
       <w:pPr>
         <w:widowControl/>
-        <w:spacing w:before="0" w:after="60" w:lineRule="auto" w:line="252"/>
+        <w:spacing w:before="0" w:after="44" w:lineRule="auto" w:line="240"/>
         <w:ind w:left="200"/>
       </w:pPr>
       <w:r>
@@ -1632,7 +1517,7 @@
     <w:p>
       <w:pPr>
         <w:widowControl/>
-        <w:spacing w:before="0" w:after="60" w:lineRule="auto" w:line="252"/>
+        <w:spacing w:before="0" w:after="44" w:lineRule="auto" w:line="240"/>
         <w:ind w:left="200"/>
       </w:pPr>
       <w:r>
@@ -1666,7 +1551,7 @@
     <w:p>
       <w:pPr>
         <w:widowControl/>
-        <w:spacing w:before="0" w:after="60" w:lineRule="auto" w:line="252"/>
+        <w:spacing w:before="0" w:after="44" w:lineRule="auto" w:line="240"/>
         <w:ind w:left="200"/>
       </w:pPr>
       <w:r>
@@ -1700,7 +1585,7 @@
     <w:p>
       <w:pPr>
         <w:widowControl/>
-        <w:spacing w:before="0" w:after="60" w:lineRule="auto" w:line="252"/>
+        <w:spacing w:before="0" w:after="44" w:lineRule="auto" w:line="240"/>
         <w:ind w:left="200"/>
       </w:pPr>
       <w:r>
@@ -1734,7 +1619,7 @@
     <w:p>
       <w:pPr>
         <w:widowControl/>
-        <w:spacing w:before="0" w:after="60" w:lineRule="auto" w:line="252"/>
+        <w:spacing w:before="0" w:after="44" w:lineRule="auto" w:line="240"/>
         <w:ind w:left="200"/>
       </w:pPr>
       <w:r>
@@ -1768,7 +1653,7 @@
     <w:p>
       <w:pPr>
         <w:widowControl/>
-        <w:spacing w:before="0" w:after="60" w:lineRule="auto" w:line="252"/>
+        <w:spacing w:before="0" w:after="44" w:lineRule="auto" w:line="240"/>
         <w:ind w:left="200"/>
       </w:pPr>
       <w:r>
@@ -1802,7 +1687,7 @@
     <w:p>
       <w:pPr>
         <w:widowControl/>
-        <w:spacing w:before="0" w:after="60" w:lineRule="auto" w:line="252"/>
+        <w:spacing w:before="0" w:after="44" w:lineRule="auto" w:line="240"/>
         <w:ind w:left="200"/>
       </w:pPr>
       <w:r>
@@ -1836,7 +1721,7 @@
     <w:p>
       <w:pPr>
         <w:widowControl/>
-        <w:spacing w:before="0" w:after="60" w:lineRule="auto" w:line="252"/>
+        <w:spacing w:before="0" w:after="44" w:lineRule="auto" w:line="240"/>
         <w:ind w:left="200"/>
       </w:pPr>
       <w:r>
@@ -1870,7 +1755,7 @@
     <w:p>
       <w:pPr>
         <w:widowControl/>
-        <w:spacing w:before="0" w:after="60" w:lineRule="auto" w:line="252"/>
+        <w:spacing w:before="0" w:after="44" w:lineRule="auto" w:line="240"/>
         <w:ind w:left="200"/>
       </w:pPr>
       <w:r>
@@ -1904,7 +1789,7 @@
     <w:p>
       <w:pPr>
         <w:widowControl/>
-        <w:spacing w:before="0" w:after="60" w:lineRule="auto" w:line="252"/>
+        <w:spacing w:before="0" w:after="44" w:lineRule="auto" w:line="240"/>
         <w:ind w:left="200"/>
       </w:pPr>
       <w:r>
@@ -1941,7 +1826,7 @@
           <w:type w:val="continuous"/>
           <w:pgSz w:w="12240" w:h="15840"/>
           <w:pgMar w:top="864" w:right="864" w:bottom="864" w:left="864" w:header="720" w:footer="720" w:gutter="0"/>
-          <w:cols w:space="300" w:num="2"/>
+          <w:cols w:space="240" w:num="2"/>
           <w:docGrid w:linePitch="360"/>
         </w:sectPr>
       </w:pPr>
@@ -1969,7 +1854,7 @@
       <w:type w:val="continuous"/>
       <w:pgSz w:w="12240" w:h="15840"/>
       <w:pgMar w:top="864" w:right="864" w:bottom="864" w:left="864" w:header="720" w:footer="720" w:gutter="0"/>
-      <w:cols w:space="300" w:num="1"/>
+      <w:cols w:space="240" w:num="1"/>
       <w:docGrid w:linePitch="360"/>
     </w:sectPr>
   </w:body>

</xml_diff>